<commit_message>
Fix right-to-left layout of the Arabic THEQA request
Arabic lines are anchored right to left (so full stops follow the last word
and bullets and numbers come first on the right), bullets are typed rather
than Word list numbering, the Markdown uses dir="rtl" blocks, and a PDF
version is added.

Co-Authored-By: Claude Opus 5.5 <noreply@anthropic.com>
Claude-Session: https://claude.ai/code/session_01Xd8FKAdLR1i6PkQ3Huivzz
</commit_message>
<xml_diff>
--- a/docs/integrations/theqa-business-use-case.docx
+++ b/docs/integrations/theqa-business-use-case.docx
@@ -17,7 +17,7 @@
           <w:szCs w:val="32"/>
           <w:rtl/>
         </w:rPr>
-        <w:t xml:space="preserve">طلب الانضمام إلى خدمات ثقة: حالة الاستخدام التجارية ومتطلبات المشروع</w:t>
+        <w:t xml:space="preserve">‏طلب الانضمام إلى خدمات ثقة: حالة الاستخدام التجارية ومتطلبات المشروع‏</w:t>
       </w:r>
     </w:p>
     <w:p>
@@ -35,7 +35,7 @@
           <w:szCs w:val="24"/>
           <w:rtl/>
         </w:rPr>
-        <w:t xml:space="preserve">منصة TrustiqLegal لإدارة مكاتب المحاماة، المقدمة من SmarThinkerz</w:t>
+        <w:t xml:space="preserve">‏منصة TrustiqLegal لإدارة مكاتب المحاماة، المقدمة من SmarThinkerz‏</w:t>
       </w:r>
     </w:p>
     <w:p>
@@ -51,7 +51,7 @@
           <w:szCs w:val="20"/>
           <w:rtl/>
         </w:rPr>
-        <w:t xml:space="preserve">إلى: مركز التصديق الإلكتروني، المركز الوطني للسلامة المعلوماتية، وزارة النقل والاتصالات وتقنية المعلومات</w:t>
+        <w:t xml:space="preserve">‏إلى: مركز التصديق الإلكتروني، المركز الوطني للسلامة المعلوماتية، وزارة النقل والاتصالات وتقنية المعلومات‏</w:t>
       </w:r>
     </w:p>
     <w:p>
@@ -67,7 +67,7 @@
           <w:szCs w:val="20"/>
           <w:rtl/>
         </w:rPr>
-        <w:t xml:space="preserve">البريد: Theqa@mtcit.gov.om و pkisupport@mtcit.gov.om</w:t>
+        <w:t xml:space="preserve">‏البريد: Theqa@mtcit.gov.om و pkisupport@mtcit.gov.om‏</w:t>
       </w:r>
     </w:p>
     <w:p>
@@ -83,7 +83,7 @@
           <w:szCs w:val="20"/>
           <w:rtl/>
         </w:rPr>
-        <w:t xml:space="preserve">التاريخ: [التاريخ]</w:t>
+        <w:t xml:space="preserve">‏التاريخ: [التاريخ]‏</w:t>
       </w:r>
     </w:p>
     <w:p>
@@ -101,7 +101,7 @@
           <w:szCs w:val="26"/>
           <w:rtl/>
         </w:rPr>
-        <w:t xml:space="preserve">1. بيانات مقدم الطلب</w:t>
+        <w:t xml:space="preserve">‏1. بيانات مقدم الطلب‏</w:t>
       </w:r>
     </w:p>
     <w:tbl>
@@ -148,7 +148,7 @@
                 <w:szCs w:val="21"/>
                 <w:rtl/>
               </w:rPr>
-              <w:t xml:space="preserve">اسم الشركة</w:t>
+              <w:t xml:space="preserve">‏اسم الشركة‏</w:t>
             </w:r>
           </w:p>
         </w:tc>
@@ -176,7 +176,7 @@
                 <w:szCs w:val="21"/>
                 <w:rtl/>
               </w:rPr>
-              <w:t xml:space="preserve">[الاسم القانوني للشركة كما في السجل التجاري]</w:t>
+              <w:t xml:space="preserve">‏[الاسم القانوني للشركة كما في السجل التجاري]‏</w:t>
             </w:r>
           </w:p>
         </w:tc>
@@ -208,7 +208,7 @@
                 <w:szCs w:val="21"/>
                 <w:rtl/>
               </w:rPr>
-              <w:t xml:space="preserve">رقم السجل التجاري</w:t>
+              <w:t xml:space="preserve">‏رقم السجل التجاري‏</w:t>
             </w:r>
           </w:p>
         </w:tc>
@@ -236,7 +236,7 @@
                 <w:szCs w:val="21"/>
                 <w:rtl/>
               </w:rPr>
-              <w:t xml:space="preserve">[رقم السجل التجاري]</w:t>
+              <w:t xml:space="preserve">‏[رقم السجل التجاري]‏</w:t>
             </w:r>
           </w:p>
         </w:tc>
@@ -268,7 +268,7 @@
                 <w:szCs w:val="21"/>
                 <w:rtl/>
               </w:rPr>
-              <w:t xml:space="preserve">اسم المنتج</w:t>
+              <w:t xml:space="preserve">‏اسم المنتج‏</w:t>
             </w:r>
           </w:p>
         </w:tc>
@@ -296,7 +296,7 @@
                 <w:szCs w:val="21"/>
                 <w:rtl/>
               </w:rPr>
-              <w:t xml:space="preserve">TrustiqLegal</w:t>
+              <w:t xml:space="preserve">‏TrustiqLegal‏</w:t>
             </w:r>
           </w:p>
         </w:tc>
@@ -328,7 +328,7 @@
                 <w:szCs w:val="21"/>
                 <w:rtl/>
               </w:rPr>
-              <w:t xml:space="preserve">الموقع الإلكتروني</w:t>
+              <w:t xml:space="preserve">‏الموقع الإلكتروني‏</w:t>
             </w:r>
           </w:p>
         </w:tc>
@@ -356,7 +356,7 @@
                 <w:szCs w:val="21"/>
                 <w:rtl/>
               </w:rPr>
-              <w:t xml:space="preserve">https://trstiqai.eqence.com</w:t>
+              <w:t xml:space="preserve">‏https://trstiqai.eqence.com‏</w:t>
             </w:r>
           </w:p>
         </w:tc>
@@ -388,7 +388,7 @@
                 <w:szCs w:val="21"/>
                 <w:rtl/>
               </w:rPr>
-              <w:t xml:space="preserve">المسؤول عن الطلب</w:t>
+              <w:t xml:space="preserve">‏المسؤول عن الطلب‏</w:t>
             </w:r>
           </w:p>
         </w:tc>
@@ -416,7 +416,7 @@
                 <w:szCs w:val="21"/>
                 <w:rtl/>
               </w:rPr>
-              <w:t xml:space="preserve">[الاسم، المسمى الوظيفي]</w:t>
+              <w:t xml:space="preserve">‏[الاسم، المسمى الوظيفي]‏</w:t>
             </w:r>
           </w:p>
         </w:tc>
@@ -448,7 +448,7 @@
                 <w:szCs w:val="21"/>
                 <w:rtl/>
               </w:rPr>
-              <w:t xml:space="preserve">الهاتف والبريد</w:t>
+              <w:t xml:space="preserve">‏الهاتف والبريد‏</w:t>
             </w:r>
           </w:p>
         </w:tc>
@@ -476,7 +476,7 @@
                 <w:szCs w:val="21"/>
                 <w:rtl/>
               </w:rPr>
-              <w:t xml:space="preserve">[رقم الهاتف]، [البريد الإلكتروني]</w:t>
+              <w:t xml:space="preserve">‏[رقم الهاتف]، [البريد الإلكتروني]‏</w:t>
             </w:r>
           </w:p>
         </w:tc>
@@ -508,7 +508,7 @@
                 <w:szCs w:val="21"/>
                 <w:rtl/>
               </w:rPr>
-              <w:t xml:space="preserve">المسؤول الفني</w:t>
+              <w:t xml:space="preserve">‏المسؤول الفني‏</w:t>
             </w:r>
           </w:p>
         </w:tc>
@@ -536,7 +536,7 @@
                 <w:szCs w:val="21"/>
                 <w:rtl/>
               </w:rPr>
-              <w:t xml:space="preserve">[الاسم، البريد الإلكتروني]</w:t>
+              <w:t xml:space="preserve">‏[الاسم، البريد الإلكتروني]‏</w:t>
             </w:r>
           </w:p>
         </w:tc>
@@ -573,39 +573,39 @@
           <w:szCs w:val="26"/>
           <w:rtl/>
         </w:rPr>
-        <w:t xml:space="preserve">2. نبذة عن المنصة</w:t>
-      </w:r>
-    </w:p>
-    <w:p>
-      <w:pPr>
-        <w:bidi/>
-        <w:spacing w:after="120"/>
-        <w:jc w:val="right"/>
-      </w:pPr>
-      <w:r>
-        <w:rPr>
-          <w:rFonts w:ascii="Calibri" w:cs="Calibri" w:hAnsi="Calibri"/>
-          <w:sz w:val="22"/>
-          <w:szCs w:val="22"/>
-          <w:rtl/>
-        </w:rPr>
-        <w:t xml:space="preserve">TrustiqLegal منصة سحابية ثنائية اللغة (العربية والإنجليزية) لإدارة مكاتب المحاماة في سلطنة عُمان ودول مجلس التعاون الخليجي. تتيح المنصة للمكاتب إدارة القضايا والموكلين والمستندات والجلسات والمواعيد والفوترة، وتوفر بوابة إلكترونية للموكلين لمتابعة قضاياهم وتبادل المستندات، إضافة إلى مساعد بحث قانوني يعتمد على نصوص التشريعات العُمانية.</w:t>
-      </w:r>
-    </w:p>
-    <w:p>
-      <w:pPr>
-        <w:bidi/>
-        <w:spacing w:after="120"/>
-        <w:jc w:val="right"/>
-      </w:pPr>
-      <w:r>
-        <w:rPr>
-          <w:rFonts w:ascii="Calibri" w:cs="Calibri" w:hAnsi="Calibri"/>
-          <w:sz w:val="22"/>
-          <w:szCs w:val="22"/>
-          <w:rtl/>
-        </w:rPr>
-        <w:t xml:space="preserve">المستخدمون هم المحامون والموظفون في مكاتب المحاماة المرخصة، وموكلو هذه المكاتب من الأفراد والشركات.</w:t>
+        <w:t xml:space="preserve">‏2. نبذة عن المنصة‏</w:t>
+      </w:r>
+    </w:p>
+    <w:p>
+      <w:pPr>
+        <w:bidi/>
+        <w:spacing w:after="120"/>
+        <w:jc w:val="right"/>
+      </w:pPr>
+      <w:r>
+        <w:rPr>
+          <w:rFonts w:ascii="Calibri" w:cs="Calibri" w:hAnsi="Calibri"/>
+          <w:sz w:val="22"/>
+          <w:szCs w:val="22"/>
+          <w:rtl/>
+        </w:rPr>
+        <w:t xml:space="preserve">‏TrustiqLegal منصة سحابية ثنائية اللغة (العربية والإنجليزية) لإدارة مكاتب المحاماة في سلطنة عُمان ودول مجلس التعاون الخليجي. تتيح المنصة للمكاتب إدارة القضايا والموكلين والمستندات والجلسات والمواعيد والفوترة، وتوفر بوابة إلكترونية للموكلين لمتابعة قضاياهم وتبادل المستندات، إضافة إلى مساعد بحث قانوني يعتمد على نصوص التشريعات العُمانية.‏</w:t>
+      </w:r>
+    </w:p>
+    <w:p>
+      <w:pPr>
+        <w:bidi/>
+        <w:spacing w:after="120"/>
+        <w:jc w:val="right"/>
+      </w:pPr>
+      <w:r>
+        <w:rPr>
+          <w:rFonts w:ascii="Calibri" w:cs="Calibri" w:hAnsi="Calibri"/>
+          <w:sz w:val="22"/>
+          <w:szCs w:val="22"/>
+          <w:rtl/>
+        </w:rPr>
+        <w:t xml:space="preserve">‏المستخدمون هم المحامون والموظفون في مكاتب المحاماة المرخصة، وموكلو هذه المكاتب من الأفراد والشركات.‏</w:t>
       </w:r>
     </w:p>
     <w:p>
@@ -623,107 +623,87 @@
           <w:szCs w:val="26"/>
           <w:rtl/>
         </w:rPr>
-        <w:t xml:space="preserve">3. الغرض من الطلب</w:t>
-      </w:r>
-    </w:p>
-    <w:p>
-      <w:pPr>
-        <w:bidi/>
-        <w:spacing w:after="120"/>
-        <w:jc w:val="right"/>
-      </w:pPr>
-      <w:r>
-        <w:rPr>
-          <w:rFonts w:ascii="Calibri" w:cs="Calibri" w:hAnsi="Calibri"/>
-          <w:sz w:val="22"/>
-          <w:szCs w:val="22"/>
-          <w:rtl/>
-        </w:rPr>
-        <w:t xml:space="preserve">نطلب الانضمام بصفتنا جهة خاصة إلى خدمات ثقة التالية، وتزويدنا بوثائق الربط الفني وبيئة الاختبار ومفاتيح الربط:</w:t>
-      </w:r>
-    </w:p>
-    <w:p>
-      <w:pPr>
-        <w:pStyle w:val="ListParagraph"/>
-        <w:numPr>
-          <w:ilvl w:val="0"/>
-          <w:numId w:val="1"/>
-        </w:numPr>
-        <w:bidi/>
-        <w:spacing w:after="120"/>
-        <w:jc w:val="right"/>
-      </w:pPr>
-      <w:r>
-        <w:rPr>
-          <w:rFonts w:ascii="Calibri" w:cs="Calibri" w:hAnsi="Calibri"/>
-          <w:sz w:val="22"/>
-          <w:szCs w:val="22"/>
-          <w:rtl/>
-        </w:rPr>
-        <w:t xml:space="preserve">بوابة الهوية (الدخول الموحد): تسجيل دخول المحامين والموظفين والموكلين إلى المنصة باستخدام تطبيق ثقة أو البطاقة الشخصية.</w:t>
-      </w:r>
-    </w:p>
-    <w:p>
-      <w:pPr>
-        <w:pStyle w:val="ListParagraph"/>
-        <w:numPr>
-          <w:ilvl w:val="0"/>
-          <w:numId w:val="1"/>
-        </w:numPr>
-        <w:bidi/>
-        <w:spacing w:after="120"/>
-        <w:jc w:val="right"/>
-      </w:pPr>
-      <w:r>
-        <w:rPr>
-          <w:rFonts w:ascii="Calibri" w:cs="Calibri" w:hAnsi="Calibri"/>
-          <w:sz w:val="22"/>
-          <w:szCs w:val="22"/>
-          <w:rtl/>
-        </w:rPr>
-        <w:t xml:space="preserve">التحقق من هوية الموكل: التحقق من هوية الموكل الجديد عند فتح ملفه لدى المكتب، بدلاً من رفع صورة البطاقة.</w:t>
-      </w:r>
-    </w:p>
-    <w:p>
-      <w:pPr>
-        <w:pStyle w:val="ListParagraph"/>
-        <w:numPr>
-          <w:ilvl w:val="0"/>
-          <w:numId w:val="1"/>
-        </w:numPr>
-        <w:bidi/>
-        <w:spacing w:after="120"/>
-        <w:jc w:val="right"/>
-      </w:pPr>
-      <w:r>
-        <w:rPr>
-          <w:rFonts w:ascii="Calibri" w:cs="Calibri" w:hAnsi="Calibri"/>
-          <w:sz w:val="22"/>
-          <w:szCs w:val="22"/>
-          <w:rtl/>
-        </w:rPr>
-        <w:t xml:space="preserve">التوقيع الإلكتروني المعتمد: توقيع المستندات القانونية إلكترونياً عبر بوابة التوقيع الرقمي.</w:t>
-      </w:r>
-    </w:p>
-    <w:p>
-      <w:pPr>
-        <w:pStyle w:val="ListParagraph"/>
-        <w:numPr>
-          <w:ilvl w:val="0"/>
-          <w:numId w:val="1"/>
-        </w:numPr>
-        <w:bidi/>
-        <w:spacing w:after="120"/>
-        <w:jc w:val="right"/>
-      </w:pPr>
-      <w:r>
-        <w:rPr>
-          <w:rFonts w:ascii="Calibri" w:cs="Calibri" w:hAnsi="Calibri"/>
-          <w:sz w:val="22"/>
-          <w:szCs w:val="22"/>
-          <w:rtl/>
-        </w:rPr>
-        <w:t xml:space="preserve">التحقق من التوقيعات: التحقق من صحة التوقيعات الرقمية على المستندات التي يتلقاها المكتب.</w:t>
+        <w:t xml:space="preserve">‏3. الغرض من الطلب‏</w:t>
+      </w:r>
+    </w:p>
+    <w:p>
+      <w:pPr>
+        <w:bidi/>
+        <w:spacing w:after="120"/>
+        <w:jc w:val="right"/>
+      </w:pPr>
+      <w:r>
+        <w:rPr>
+          <w:rFonts w:ascii="Calibri" w:cs="Calibri" w:hAnsi="Calibri"/>
+          <w:sz w:val="22"/>
+          <w:szCs w:val="22"/>
+          <w:rtl/>
+        </w:rPr>
+        <w:t xml:space="preserve">‏نطلب الانضمام بصفتنا جهة خاصة إلى خدمات ثقة التالية، وتزويدنا بوثائق الربط الفني وبيئة الاختبار ومفاتيح الربط:‏</w:t>
+      </w:r>
+    </w:p>
+    <w:p>
+      <w:pPr>
+        <w:bidi/>
+        <w:spacing w:after="120"/>
+        <w:jc w:val="right"/>
+      </w:pPr>
+      <w:r>
+        <w:rPr>
+          <w:rFonts w:ascii="Calibri" w:cs="Calibri" w:hAnsi="Calibri"/>
+          <w:sz w:val="22"/>
+          <w:szCs w:val="22"/>
+          <w:rtl/>
+        </w:rPr>
+        <w:t xml:space="preserve">•  ‏بوابة الهوية (الدخول الموحد): تسجيل دخول المحامين والموظفين والموكلين إلى المنصة باستخدام تطبيق ثقة أو البطاقة الشخصية.‏</w:t>
+      </w:r>
+    </w:p>
+    <w:p>
+      <w:pPr>
+        <w:bidi/>
+        <w:spacing w:after="120"/>
+        <w:jc w:val="right"/>
+      </w:pPr>
+      <w:r>
+        <w:rPr>
+          <w:rFonts w:ascii="Calibri" w:cs="Calibri" w:hAnsi="Calibri"/>
+          <w:sz w:val="22"/>
+          <w:szCs w:val="22"/>
+          <w:rtl/>
+        </w:rPr>
+        <w:t xml:space="preserve">•  ‏التحقق من هوية الموكل: التحقق من هوية الموكل الجديد عند فتح ملفه لدى المكتب، بدلاً من رفع صورة البطاقة.‏</w:t>
+      </w:r>
+    </w:p>
+    <w:p>
+      <w:pPr>
+        <w:bidi/>
+        <w:spacing w:after="120"/>
+        <w:jc w:val="right"/>
+      </w:pPr>
+      <w:r>
+        <w:rPr>
+          <w:rFonts w:ascii="Calibri" w:cs="Calibri" w:hAnsi="Calibri"/>
+          <w:sz w:val="22"/>
+          <w:szCs w:val="22"/>
+          <w:rtl/>
+        </w:rPr>
+        <w:t xml:space="preserve">•  ‏التوقيع الإلكتروني المعتمد: توقيع المستندات القانونية إلكترونياً عبر بوابة التوقيع الرقمي.‏</w:t>
+      </w:r>
+    </w:p>
+    <w:p>
+      <w:pPr>
+        <w:bidi/>
+        <w:spacing w:after="120"/>
+        <w:jc w:val="right"/>
+      </w:pPr>
+      <w:r>
+        <w:rPr>
+          <w:rFonts w:ascii="Calibri" w:cs="Calibri" w:hAnsi="Calibri"/>
+          <w:sz w:val="22"/>
+          <w:szCs w:val="22"/>
+          <w:rtl/>
+        </w:rPr>
+        <w:t xml:space="preserve">•  ‏التحقق من التوقيعات: التحقق من صحة التوقيعات الرقمية على المستندات التي يتلقاها المكتب.‏</w:t>
       </w:r>
     </w:p>
     <w:p>
@@ -741,7 +721,7 @@
           <w:szCs w:val="26"/>
           <w:rtl/>
         </w:rPr>
-        <w:t xml:space="preserve">4. حالات الاستخدام التفصيلية</w:t>
+        <w:t xml:space="preserve">‏4. حالات الاستخدام التفصيلية‏</w:t>
       </w:r>
     </w:p>
     <w:p>
@@ -759,91 +739,71 @@
           <w:szCs w:val="23"/>
           <w:rtl/>
         </w:rPr>
-        <w:t xml:space="preserve">4.1 تسجيل الدخول</w:t>
-      </w:r>
-    </w:p>
-    <w:p>
-      <w:pPr>
-        <w:pStyle w:val="ListParagraph"/>
-        <w:numPr>
-          <w:ilvl w:val="0"/>
-          <w:numId w:val="1"/>
-        </w:numPr>
-        <w:bidi/>
-        <w:spacing w:after="120"/>
-        <w:jc w:val="right"/>
-      </w:pPr>
-      <w:r>
-        <w:rPr>
-          <w:rFonts w:ascii="Calibri" w:cs="Calibri" w:hAnsi="Calibri"/>
-          <w:sz w:val="22"/>
-          <w:szCs w:val="22"/>
-          <w:rtl/>
-        </w:rPr>
-        <w:t xml:space="preserve">يختار المستخدم "الدخول عبر ثقة" في صفحة الدخول.</w:t>
-      </w:r>
-    </w:p>
-    <w:p>
-      <w:pPr>
-        <w:pStyle w:val="ListParagraph"/>
-        <w:numPr>
-          <w:ilvl w:val="0"/>
-          <w:numId w:val="1"/>
-        </w:numPr>
-        <w:bidi/>
-        <w:spacing w:after="120"/>
-        <w:jc w:val="right"/>
-      </w:pPr>
-      <w:r>
-        <w:rPr>
-          <w:rFonts w:ascii="Calibri" w:cs="Calibri" w:hAnsi="Calibri"/>
-          <w:sz w:val="22"/>
-          <w:szCs w:val="22"/>
-          <w:rtl/>
-        </w:rPr>
-        <w:t xml:space="preserve">يوافق على طلب الدخول عبر الإشعار في تطبيق ثقة أو بمسح رمز QR، ثم يُدخل الرقم السري.</w:t>
-      </w:r>
-    </w:p>
-    <w:p>
-      <w:pPr>
-        <w:pStyle w:val="ListParagraph"/>
-        <w:numPr>
-          <w:ilvl w:val="0"/>
-          <w:numId w:val="1"/>
-        </w:numPr>
-        <w:bidi/>
-        <w:spacing w:after="120"/>
-        <w:jc w:val="right"/>
-      </w:pPr>
-      <w:r>
-        <w:rPr>
-          <w:rFonts w:ascii="Calibri" w:cs="Calibri" w:hAnsi="Calibri"/>
-          <w:sz w:val="22"/>
-          <w:szCs w:val="22"/>
-          <w:rtl/>
-        </w:rPr>
-        <w:t xml:space="preserve">تربط المنصة الهوية بحساب المستخدم القائم في مكتبه، ولا تُنشئ حساباً جديداً تلقائياً.</w:t>
-      </w:r>
-    </w:p>
-    <w:p>
-      <w:pPr>
-        <w:pStyle w:val="ListParagraph"/>
-        <w:numPr>
-          <w:ilvl w:val="0"/>
-          <w:numId w:val="1"/>
-        </w:numPr>
-        <w:bidi/>
-        <w:spacing w:after="120"/>
-        <w:jc w:val="right"/>
-      </w:pPr>
-      <w:r>
-        <w:rPr>
-          <w:rFonts w:ascii="Calibri" w:cs="Calibri" w:hAnsi="Calibri"/>
-          <w:sz w:val="22"/>
-          <w:szCs w:val="22"/>
-          <w:rtl/>
-        </w:rPr>
-        <w:t xml:space="preserve">يُستخدم مستوى التحقق المتوسط على الأقل.</w:t>
+        <w:t xml:space="preserve">‏4.1 تسجيل الدخول‏</w:t>
+      </w:r>
+    </w:p>
+    <w:p>
+      <w:pPr>
+        <w:bidi/>
+        <w:spacing w:after="120"/>
+        <w:jc w:val="right"/>
+      </w:pPr>
+      <w:r>
+        <w:rPr>
+          <w:rFonts w:ascii="Calibri" w:cs="Calibri" w:hAnsi="Calibri"/>
+          <w:sz w:val="22"/>
+          <w:szCs w:val="22"/>
+          <w:rtl/>
+        </w:rPr>
+        <w:t xml:space="preserve">•  ‏يختار المستخدم "الدخول عبر ثقة" في صفحة الدخول.‏</w:t>
+      </w:r>
+    </w:p>
+    <w:p>
+      <w:pPr>
+        <w:bidi/>
+        <w:spacing w:after="120"/>
+        <w:jc w:val="right"/>
+      </w:pPr>
+      <w:r>
+        <w:rPr>
+          <w:rFonts w:ascii="Calibri" w:cs="Calibri" w:hAnsi="Calibri"/>
+          <w:sz w:val="22"/>
+          <w:szCs w:val="22"/>
+          <w:rtl/>
+        </w:rPr>
+        <w:t xml:space="preserve">•  ‏يوافق على طلب الدخول عبر الإشعار في تطبيق ثقة أو بمسح رمز QR، ثم يُدخل الرقم السري.‏</w:t>
+      </w:r>
+    </w:p>
+    <w:p>
+      <w:pPr>
+        <w:bidi/>
+        <w:spacing w:after="120"/>
+        <w:jc w:val="right"/>
+      </w:pPr>
+      <w:r>
+        <w:rPr>
+          <w:rFonts w:ascii="Calibri" w:cs="Calibri" w:hAnsi="Calibri"/>
+          <w:sz w:val="22"/>
+          <w:szCs w:val="22"/>
+          <w:rtl/>
+        </w:rPr>
+        <w:t xml:space="preserve">•  ‏تربط المنصة الهوية بحساب المستخدم القائم في مكتبه، ولا تُنشئ حساباً جديداً تلقائياً.‏</w:t>
+      </w:r>
+    </w:p>
+    <w:p>
+      <w:pPr>
+        <w:bidi/>
+        <w:spacing w:after="120"/>
+        <w:jc w:val="right"/>
+      </w:pPr>
+      <w:r>
+        <w:rPr>
+          <w:rFonts w:ascii="Calibri" w:cs="Calibri" w:hAnsi="Calibri"/>
+          <w:sz w:val="22"/>
+          <w:szCs w:val="22"/>
+          <w:rtl/>
+        </w:rPr>
+        <w:t xml:space="preserve">•  ‏يُستخدم مستوى التحقق المتوسط على الأقل.‏</w:t>
       </w:r>
     </w:p>
     <w:p>
@@ -861,70 +821,55 @@
           <w:szCs w:val="23"/>
           <w:rtl/>
         </w:rPr>
-        <w:t xml:space="preserve">4.2 التحقق من هوية الموكل</w:t>
-      </w:r>
-    </w:p>
-    <w:p>
-      <w:pPr>
-        <w:pStyle w:val="ListParagraph"/>
-        <w:numPr>
-          <w:ilvl w:val="0"/>
-          <w:numId w:val="1"/>
-        </w:numPr>
-        <w:bidi/>
-        <w:spacing w:after="120"/>
-        <w:jc w:val="right"/>
-      </w:pPr>
-      <w:r>
-        <w:rPr>
-          <w:rFonts w:ascii="Calibri" w:cs="Calibri" w:hAnsi="Calibri"/>
-          <w:sz w:val="22"/>
-          <w:szCs w:val="22"/>
-          <w:rtl/>
-        </w:rPr>
-        <w:t xml:space="preserve">عند فتح ملف موكل جديد يرسل المكتب للموكل رابطاً للتحقق من هويته عبر ثقة.</w:t>
-      </w:r>
-    </w:p>
-    <w:p>
-      <w:pPr>
-        <w:pStyle w:val="ListParagraph"/>
-        <w:numPr>
-          <w:ilvl w:val="0"/>
-          <w:numId w:val="1"/>
-        </w:numPr>
-        <w:bidi/>
-        <w:spacing w:after="120"/>
-        <w:jc w:val="right"/>
-      </w:pPr>
-      <w:r>
-        <w:rPr>
-          <w:rFonts w:ascii="Calibri" w:cs="Calibri" w:hAnsi="Calibri"/>
-          <w:sz w:val="22"/>
-          <w:szCs w:val="22"/>
-          <w:rtl/>
-        </w:rPr>
-        <w:t xml:space="preserve">تحفظ المنصة نتيجة التحقق ووقته والبيانات التي يوافق الموكل على مشاركتها فقط، ضمن ملف "اعرف عميلك" للمكتب.</w:t>
-      </w:r>
-    </w:p>
-    <w:p>
-      <w:pPr>
-        <w:pStyle w:val="ListParagraph"/>
-        <w:numPr>
-          <w:ilvl w:val="0"/>
-          <w:numId w:val="1"/>
-        </w:numPr>
-        <w:bidi/>
-        <w:spacing w:after="120"/>
-        <w:jc w:val="right"/>
-      </w:pPr>
-      <w:r>
-        <w:rPr>
-          <w:rFonts w:ascii="Calibri" w:cs="Calibri" w:hAnsi="Calibri"/>
-          <w:sz w:val="22"/>
-          <w:szCs w:val="22"/>
-          <w:rtl/>
-        </w:rPr>
-        <w:t xml:space="preserve">يدعم ذلك التزامات المكاتب في التحقق من هوية العملاء.</w:t>
+        <w:t xml:space="preserve">‏4.2 التحقق من هوية الموكل‏</w:t>
+      </w:r>
+    </w:p>
+    <w:p>
+      <w:pPr>
+        <w:bidi/>
+        <w:spacing w:after="120"/>
+        <w:jc w:val="right"/>
+      </w:pPr>
+      <w:r>
+        <w:rPr>
+          <w:rFonts w:ascii="Calibri" w:cs="Calibri" w:hAnsi="Calibri"/>
+          <w:sz w:val="22"/>
+          <w:szCs w:val="22"/>
+          <w:rtl/>
+        </w:rPr>
+        <w:t xml:space="preserve">•  ‏عند فتح ملف موكل جديد يرسل المكتب للموكل رابطاً للتحقق من هويته عبر ثقة.‏</w:t>
+      </w:r>
+    </w:p>
+    <w:p>
+      <w:pPr>
+        <w:bidi/>
+        <w:spacing w:after="120"/>
+        <w:jc w:val="right"/>
+      </w:pPr>
+      <w:r>
+        <w:rPr>
+          <w:rFonts w:ascii="Calibri" w:cs="Calibri" w:hAnsi="Calibri"/>
+          <w:sz w:val="22"/>
+          <w:szCs w:val="22"/>
+          <w:rtl/>
+        </w:rPr>
+        <w:t xml:space="preserve">•  ‏تحفظ المنصة نتيجة التحقق ووقته والبيانات التي يوافق الموكل على مشاركتها فقط، ضمن ملف "اعرف عميلك" للمكتب.‏</w:t>
+      </w:r>
+    </w:p>
+    <w:p>
+      <w:pPr>
+        <w:bidi/>
+        <w:spacing w:after="120"/>
+        <w:jc w:val="right"/>
+      </w:pPr>
+      <w:r>
+        <w:rPr>
+          <w:rFonts w:ascii="Calibri" w:cs="Calibri" w:hAnsi="Calibri"/>
+          <w:sz w:val="22"/>
+          <w:szCs w:val="22"/>
+          <w:rtl/>
+        </w:rPr>
+        <w:t xml:space="preserve">•  ‏يدعم ذلك التزامات المكاتب في التحقق من هوية العملاء.‏</w:t>
       </w:r>
     </w:p>
     <w:p>
@@ -942,112 +887,87 @@
           <w:szCs w:val="23"/>
           <w:rtl/>
         </w:rPr>
-        <w:t xml:space="preserve">4.3 التوقيع الإلكتروني المعتمد</w:t>
-      </w:r>
-    </w:p>
-    <w:p>
-      <w:pPr>
-        <w:pStyle w:val="ListParagraph"/>
-        <w:numPr>
-          <w:ilvl w:val="0"/>
-          <w:numId w:val="1"/>
-        </w:numPr>
-        <w:bidi/>
-        <w:spacing w:after="120"/>
-        <w:jc w:val="right"/>
-      </w:pPr>
-      <w:r>
-        <w:rPr>
-          <w:rFonts w:ascii="Calibri" w:cs="Calibri" w:hAnsi="Calibri"/>
-          <w:sz w:val="22"/>
-          <w:szCs w:val="22"/>
-          <w:rtl/>
-        </w:rPr>
-        <w:t xml:space="preserve">أمثلة على المستندات: اتفاقيات أتعاب المحاماة وخطابات التكليف، واتفاقيات التسوية، وإقرارات الموكل، والمحاضر الداخلية.</w:t>
-      </w:r>
-    </w:p>
-    <w:p>
-      <w:pPr>
-        <w:pStyle w:val="ListParagraph"/>
-        <w:numPr>
-          <w:ilvl w:val="0"/>
-          <w:numId w:val="1"/>
-        </w:numPr>
-        <w:bidi/>
-        <w:spacing w:after="120"/>
-        <w:jc w:val="right"/>
-      </w:pPr>
-      <w:r>
-        <w:rPr>
-          <w:rFonts w:ascii="Calibri" w:cs="Calibri" w:hAnsi="Calibri"/>
-          <w:sz w:val="22"/>
-          <w:szCs w:val="22"/>
-          <w:rtl/>
-        </w:rPr>
-        <w:t xml:space="preserve">يرسل المحامي المستند للتوقيع من المنصة، فيصل للموقّع طلب توقيع في تطبيق ثقة.</w:t>
-      </w:r>
-    </w:p>
-    <w:p>
-      <w:pPr>
-        <w:pStyle w:val="ListParagraph"/>
-        <w:numPr>
-          <w:ilvl w:val="0"/>
-          <w:numId w:val="1"/>
-        </w:numPr>
-        <w:bidi/>
-        <w:spacing w:after="120"/>
-        <w:jc w:val="right"/>
-      </w:pPr>
-      <w:r>
-        <w:rPr>
-          <w:rFonts w:ascii="Calibri" w:cs="Calibri" w:hAnsi="Calibri"/>
-          <w:sz w:val="22"/>
-          <w:szCs w:val="22"/>
-          <w:rtl/>
-        </w:rPr>
-        <w:t xml:space="preserve">يتطلب التوقيع رفع هوية الموقّع إلى المستوى العالي وفق متطلبات ثقة.</w:t>
-      </w:r>
-    </w:p>
-    <w:p>
-      <w:pPr>
-        <w:pStyle w:val="ListParagraph"/>
-        <w:numPr>
-          <w:ilvl w:val="0"/>
-          <w:numId w:val="1"/>
-        </w:numPr>
-        <w:bidi/>
-        <w:spacing w:after="120"/>
-        <w:jc w:val="right"/>
-      </w:pPr>
-      <w:r>
-        <w:rPr>
-          <w:rFonts w:ascii="Calibri" w:cs="Calibri" w:hAnsi="Calibri"/>
-          <w:sz w:val="22"/>
-          <w:szCs w:val="22"/>
-          <w:rtl/>
-        </w:rPr>
-        <w:t xml:space="preserve">تحفظ المنصة المستند الموقّع ونتيجة التحقق منه في سجل المستند.</w:t>
-      </w:r>
-    </w:p>
-    <w:p>
-      <w:pPr>
-        <w:pStyle w:val="ListParagraph"/>
-        <w:numPr>
-          <w:ilvl w:val="0"/>
-          <w:numId w:val="1"/>
-        </w:numPr>
-        <w:bidi/>
-        <w:spacing w:after="120"/>
-        <w:jc w:val="right"/>
-      </w:pPr>
-      <w:r>
-        <w:rPr>
-          <w:rFonts w:ascii="Calibri" w:cs="Calibri" w:hAnsi="Calibri"/>
-          <w:sz w:val="22"/>
-          <w:szCs w:val="22"/>
-          <w:rtl/>
-        </w:rPr>
-        <w:t xml:space="preserve">لا تُستخدم الخدمة للمستندات التي يشترط القانون توثيقها أمام الكاتب بالعدل أو جهة أخرى، إلا وفق ما تسمح به الأنظمة.</w:t>
+        <w:t xml:space="preserve">‏4.3 التوقيع الإلكتروني المعتمد‏</w:t>
+      </w:r>
+    </w:p>
+    <w:p>
+      <w:pPr>
+        <w:bidi/>
+        <w:spacing w:after="120"/>
+        <w:jc w:val="right"/>
+      </w:pPr>
+      <w:r>
+        <w:rPr>
+          <w:rFonts w:ascii="Calibri" w:cs="Calibri" w:hAnsi="Calibri"/>
+          <w:sz w:val="22"/>
+          <w:szCs w:val="22"/>
+          <w:rtl/>
+        </w:rPr>
+        <w:t xml:space="preserve">•  ‏أمثلة على المستندات: اتفاقيات أتعاب المحاماة وخطابات التكليف، واتفاقيات التسوية، وإقرارات الموكل، والمحاضر الداخلية.‏</w:t>
+      </w:r>
+    </w:p>
+    <w:p>
+      <w:pPr>
+        <w:bidi/>
+        <w:spacing w:after="120"/>
+        <w:jc w:val="right"/>
+      </w:pPr>
+      <w:r>
+        <w:rPr>
+          <w:rFonts w:ascii="Calibri" w:cs="Calibri" w:hAnsi="Calibri"/>
+          <w:sz w:val="22"/>
+          <w:szCs w:val="22"/>
+          <w:rtl/>
+        </w:rPr>
+        <w:t xml:space="preserve">•  ‏يرسل المحامي المستند للتوقيع من المنصة، فيصل للموقّع طلب توقيع في تطبيق ثقة.‏</w:t>
+      </w:r>
+    </w:p>
+    <w:p>
+      <w:pPr>
+        <w:bidi/>
+        <w:spacing w:after="120"/>
+        <w:jc w:val="right"/>
+      </w:pPr>
+      <w:r>
+        <w:rPr>
+          <w:rFonts w:ascii="Calibri" w:cs="Calibri" w:hAnsi="Calibri"/>
+          <w:sz w:val="22"/>
+          <w:szCs w:val="22"/>
+          <w:rtl/>
+        </w:rPr>
+        <w:t xml:space="preserve">•  ‏يتطلب التوقيع رفع هوية الموقّع إلى المستوى العالي وفق متطلبات ثقة.‏</w:t>
+      </w:r>
+    </w:p>
+    <w:p>
+      <w:pPr>
+        <w:bidi/>
+        <w:spacing w:after="120"/>
+        <w:jc w:val="right"/>
+      </w:pPr>
+      <w:r>
+        <w:rPr>
+          <w:rFonts w:ascii="Calibri" w:cs="Calibri" w:hAnsi="Calibri"/>
+          <w:sz w:val="22"/>
+          <w:szCs w:val="22"/>
+          <w:rtl/>
+        </w:rPr>
+        <w:t xml:space="preserve">•  ‏تحفظ المنصة المستند الموقّع ونتيجة التحقق منه في سجل المستند.‏</w:t>
+      </w:r>
+    </w:p>
+    <w:p>
+      <w:pPr>
+        <w:bidi/>
+        <w:spacing w:after="120"/>
+        <w:jc w:val="right"/>
+      </w:pPr>
+      <w:r>
+        <w:rPr>
+          <w:rFonts w:ascii="Calibri" w:cs="Calibri" w:hAnsi="Calibri"/>
+          <w:sz w:val="22"/>
+          <w:szCs w:val="22"/>
+          <w:rtl/>
+        </w:rPr>
+        <w:t xml:space="preserve">•  ‏لا تُستخدم الخدمة للمستندات التي يشترط القانون توثيقها أمام الكاتب بالعدل أو جهة أخرى، إلا وفق ما تسمح به الأنظمة.‏</w:t>
       </w:r>
     </w:p>
     <w:p>
@@ -1065,28 +985,23 @@
           <w:szCs w:val="23"/>
           <w:rtl/>
         </w:rPr>
-        <w:t xml:space="preserve">4.4 التحقق من المستندات الموقعة</w:t>
-      </w:r>
-    </w:p>
-    <w:p>
-      <w:pPr>
-        <w:pStyle w:val="ListParagraph"/>
-        <w:numPr>
-          <w:ilvl w:val="0"/>
-          <w:numId w:val="1"/>
-        </w:numPr>
-        <w:bidi/>
-        <w:spacing w:after="120"/>
-        <w:jc w:val="right"/>
-      </w:pPr>
-      <w:r>
-        <w:rPr>
-          <w:rFonts w:ascii="Calibri" w:cs="Calibri" w:hAnsi="Calibri"/>
-          <w:sz w:val="22"/>
-          <w:szCs w:val="22"/>
-          <w:rtl/>
-        </w:rPr>
-        <w:t xml:space="preserve">يرفع المحامي مستنداً موقعاً رقمياً تلقاه من جهة أخرى، فتتحقق المنصة من صحة التوقيع وسريان الشهادة عبر خدمة التحقق، وتعرض النتيجة.</w:t>
+        <w:t xml:space="preserve">‏4.4 التحقق من المستندات الموقعة‏</w:t>
+      </w:r>
+    </w:p>
+    <w:p>
+      <w:pPr>
+        <w:bidi/>
+        <w:spacing w:after="120"/>
+        <w:jc w:val="right"/>
+      </w:pPr>
+      <w:r>
+        <w:rPr>
+          <w:rFonts w:ascii="Calibri" w:cs="Calibri" w:hAnsi="Calibri"/>
+          <w:sz w:val="22"/>
+          <w:szCs w:val="22"/>
+          <w:rtl/>
+        </w:rPr>
+        <w:t xml:space="preserve">•  ‏يرفع المحامي مستنداً موقعاً رقمياً تلقاه من جهة أخرى، فتتحقق المنصة من صحة التوقيع وسريان الشهادة عبر خدمة التحقق، وتعرض النتيجة.‏</w:t>
       </w:r>
     </w:p>
     <w:p>
@@ -1104,23 +1019,23 @@
           <w:szCs w:val="26"/>
           <w:rtl/>
         </w:rPr>
-        <w:t xml:space="preserve">5. البيانات المطلوبة من خدمات ثقة</w:t>
-      </w:r>
-    </w:p>
-    <w:p>
-      <w:pPr>
-        <w:bidi/>
-        <w:spacing w:after="120"/>
-        <w:jc w:val="right"/>
-      </w:pPr>
-      <w:r>
-        <w:rPr>
-          <w:rFonts w:ascii="Calibri" w:cs="Calibri" w:hAnsi="Calibri"/>
-          <w:sz w:val="22"/>
-          <w:szCs w:val="22"/>
-          <w:rtl/>
-        </w:rPr>
-        <w:t xml:space="preserve">نطلب أقل قدر من البيانات اللازمة لكل حالة استخدام:</w:t>
+        <w:t xml:space="preserve">‏5. البيانات المطلوبة من خدمات ثقة‏</w:t>
+      </w:r>
+    </w:p>
+    <w:p>
+      <w:pPr>
+        <w:bidi/>
+        <w:spacing w:after="120"/>
+        <w:jc w:val="right"/>
+      </w:pPr>
+      <w:r>
+        <w:rPr>
+          <w:rFonts w:ascii="Calibri" w:cs="Calibri" w:hAnsi="Calibri"/>
+          <w:sz w:val="22"/>
+          <w:szCs w:val="22"/>
+          <w:rtl/>
+        </w:rPr>
+        <w:t xml:space="preserve">‏نطلب أقل قدر من البيانات اللازمة لكل حالة استخدام:‏</w:t>
       </w:r>
     </w:p>
     <w:tbl>
@@ -1167,7 +1082,7 @@
                 <w:szCs w:val="21"/>
                 <w:rtl/>
               </w:rPr>
-              <w:t xml:space="preserve">حالة الاستخدام</w:t>
+              <w:t xml:space="preserve">‏حالة الاستخدام‏</w:t>
             </w:r>
           </w:p>
         </w:tc>
@@ -1197,7 +1112,7 @@
                 <w:szCs w:val="21"/>
                 <w:rtl/>
               </w:rPr>
-              <w:t xml:space="preserve">البيانات المطلوبة</w:t>
+              <w:t xml:space="preserve">‏البيانات المطلوبة‏</w:t>
             </w:r>
           </w:p>
         </w:tc>
@@ -1227,7 +1142,7 @@
                 <w:szCs w:val="21"/>
                 <w:rtl/>
               </w:rPr>
-              <w:t xml:space="preserve">تسجيل الدخول</w:t>
+              <w:t xml:space="preserve">‏تسجيل الدخول‏</w:t>
             </w:r>
           </w:p>
         </w:tc>
@@ -1255,7 +1170,7 @@
                 <w:szCs w:val="21"/>
                 <w:rtl/>
               </w:rPr>
-              <w:t xml:space="preserve">معرّف ثابت للمستخدم، والاسم بالعربية والإنجليزية، ومستوى التحقق</w:t>
+              <w:t xml:space="preserve">‏معرّف ثابت للمستخدم، والاسم بالعربية والإنجليزية، ومستوى التحقق‏</w:t>
             </w:r>
           </w:p>
         </w:tc>
@@ -1285,7 +1200,7 @@
                 <w:szCs w:val="21"/>
                 <w:rtl/>
               </w:rPr>
-              <w:t xml:space="preserve">التحقق من هوية الموكل</w:t>
+              <w:t xml:space="preserve">‏التحقق من هوية الموكل‏</w:t>
             </w:r>
           </w:p>
         </w:tc>
@@ -1313,7 +1228,7 @@
                 <w:szCs w:val="21"/>
                 <w:rtl/>
               </w:rPr>
-              <w:t xml:space="preserve">الرقم المدني، والاسم بالعربية والإنجليزية، والجنسية، وتاريخ الميلاد، ومستوى التحقق</w:t>
+              <w:t xml:space="preserve">‏الرقم المدني، والاسم بالعربية والإنجليزية، والجنسية، وتاريخ الميلاد، ومستوى التحقق‏</w:t>
             </w:r>
           </w:p>
         </w:tc>
@@ -1343,7 +1258,7 @@
                 <w:szCs w:val="21"/>
                 <w:rtl/>
               </w:rPr>
-              <w:t xml:space="preserve">التوقيع الإلكتروني</w:t>
+              <w:t xml:space="preserve">‏التوقيع الإلكتروني‏</w:t>
             </w:r>
           </w:p>
         </w:tc>
@@ -1371,7 +1286,7 @@
                 <w:szCs w:val="21"/>
                 <w:rtl/>
               </w:rPr>
-              <w:t xml:space="preserve">المستند الموقّع، وبيانات شهادة الموقّع، والختم الزمني</w:t>
+              <w:t xml:space="preserve">‏المستند الموقّع، وبيانات شهادة الموقّع، والختم الزمني‏</w:t>
             </w:r>
           </w:p>
         </w:tc>
@@ -1401,7 +1316,7 @@
                 <w:szCs w:val="21"/>
                 <w:rtl/>
               </w:rPr>
-              <w:t xml:space="preserve">التحقق من التوقيع</w:t>
+              <w:t xml:space="preserve">‏التحقق من التوقيع‏</w:t>
             </w:r>
           </w:p>
         </w:tc>
@@ -1429,7 +1344,7 @@
                 <w:szCs w:val="21"/>
                 <w:rtl/>
               </w:rPr>
-              <w:t xml:space="preserve">نتيجة التحقق وبيانات الشهادة وحالة سريانها</w:t>
+              <w:t xml:space="preserve">‏نتيجة التحقق وبيانات الشهادة وحالة سريانها‏</w:t>
             </w:r>
           </w:p>
         </w:tc>
@@ -1466,133 +1381,103 @@
           <w:szCs w:val="26"/>
           <w:rtl/>
         </w:rPr>
-        <w:t xml:space="preserve">6. المتطلبات الفنية</w:t>
-      </w:r>
-    </w:p>
-    <w:p>
-      <w:pPr>
-        <w:pStyle w:val="ListParagraph"/>
-        <w:numPr>
-          <w:ilvl w:val="0"/>
-          <w:numId w:val="1"/>
-        </w:numPr>
-        <w:bidi/>
-        <w:spacing w:after="120"/>
-        <w:jc w:val="right"/>
-      </w:pPr>
-      <w:r>
-        <w:rPr>
-          <w:rFonts w:ascii="Calibri" w:cs="Calibri" w:hAnsi="Calibri"/>
-          <w:sz w:val="22"/>
-          <w:szCs w:val="22"/>
-          <w:rtl/>
-        </w:rPr>
-        <w:t xml:space="preserve">نوع التطبيق: تطبيق ويب يعمل على المتصفح في الحاسوب والهاتف، ويعمل على خوادمنا (Node.js وقاعدة بيانات PostgreSQL).</w:t>
-      </w:r>
-    </w:p>
-    <w:p>
-      <w:pPr>
-        <w:pStyle w:val="ListParagraph"/>
-        <w:numPr>
-          <w:ilvl w:val="0"/>
-          <w:numId w:val="1"/>
-        </w:numPr>
-        <w:bidi/>
-        <w:spacing w:after="120"/>
-        <w:jc w:val="right"/>
-      </w:pPr>
-      <w:r>
-        <w:rPr>
-          <w:rFonts w:ascii="Calibri" w:cs="Calibri" w:hAnsi="Calibri"/>
-          <w:sz w:val="22"/>
-          <w:szCs w:val="22"/>
-          <w:rtl/>
-        </w:rPr>
-        <w:t xml:space="preserve">الدخول: نفضّل معيار OpenID Connect أو OAuth 2.0، أو SAML 2.0، مع دعم الإشعار ورمز QR.</w:t>
-      </w:r>
-    </w:p>
-    <w:p>
-      <w:pPr>
-        <w:pStyle w:val="ListParagraph"/>
-        <w:numPr>
-          <w:ilvl w:val="0"/>
-          <w:numId w:val="1"/>
-        </w:numPr>
-        <w:bidi/>
-        <w:spacing w:after="120"/>
-        <w:jc w:val="right"/>
-      </w:pPr>
-      <w:r>
-        <w:rPr>
-          <w:rFonts w:ascii="Calibri" w:cs="Calibri" w:hAnsi="Calibri"/>
-          <w:sz w:val="22"/>
-          <w:szCs w:val="22"/>
-          <w:rtl/>
-        </w:rPr>
-        <w:t xml:space="preserve">التوقيع: واجهة برمجية لإرسال طلب توقيع واستلام النتيجة عبر رابط رد (callback)، ونفضّل الحصول على ملف PDF موقّع بصيغة PAdES مع ختم زمني.</w:t>
-      </w:r>
-    </w:p>
-    <w:p>
-      <w:pPr>
-        <w:pStyle w:val="ListParagraph"/>
-        <w:numPr>
-          <w:ilvl w:val="0"/>
-          <w:numId w:val="1"/>
-        </w:numPr>
-        <w:bidi/>
-        <w:spacing w:after="120"/>
-        <w:jc w:val="right"/>
-      </w:pPr>
-      <w:r>
-        <w:rPr>
-          <w:rFonts w:ascii="Calibri" w:cs="Calibri" w:hAnsi="Calibri"/>
-          <w:sz w:val="22"/>
-          <w:szCs w:val="22"/>
-          <w:rtl/>
-        </w:rPr>
-        <w:t xml:space="preserve">التحقق: واجهة برمجية للتحقق من التوقيع وحالة الشهادة (OCSP).</w:t>
-      </w:r>
-    </w:p>
-    <w:p>
-      <w:pPr>
-        <w:pStyle w:val="ListParagraph"/>
-        <w:numPr>
-          <w:ilvl w:val="0"/>
-          <w:numId w:val="1"/>
-        </w:numPr>
-        <w:bidi/>
-        <w:spacing w:after="120"/>
-        <w:jc w:val="right"/>
-      </w:pPr>
-      <w:r>
-        <w:rPr>
-          <w:rFonts w:ascii="Calibri" w:cs="Calibri" w:hAnsi="Calibri"/>
-          <w:sz w:val="22"/>
-          <w:szCs w:val="22"/>
-          <w:rtl/>
-        </w:rPr>
-        <w:t xml:space="preserve">بيئة اختبار (Sandbox) وحسابات اختبار قبل الانتقال إلى بيئة الإنتاج.</w:t>
-      </w:r>
-    </w:p>
-    <w:p>
-      <w:pPr>
-        <w:pStyle w:val="ListParagraph"/>
-        <w:numPr>
-          <w:ilvl w:val="0"/>
-          <w:numId w:val="1"/>
-        </w:numPr>
-        <w:bidi/>
-        <w:spacing w:after="120"/>
-        <w:jc w:val="right"/>
-      </w:pPr>
-      <w:r>
-        <w:rPr>
-          <w:rFonts w:ascii="Calibri" w:cs="Calibri" w:hAnsi="Calibri"/>
-          <w:sz w:val="22"/>
-          <w:szCs w:val="22"/>
-          <w:rtl/>
-        </w:rPr>
-        <w:t xml:space="preserve">نلتزم بأي متطلبات ربط تحددها الوزارة، مثل الشهادات الرقمية للخادم، أو تقييد عناوين IP، أو الاتصال الآمن المتبادل (mTLS).</w:t>
+        <w:t xml:space="preserve">‏6. المتطلبات الفنية‏</w:t>
+      </w:r>
+    </w:p>
+    <w:p>
+      <w:pPr>
+        <w:bidi/>
+        <w:spacing w:after="120"/>
+        <w:jc w:val="right"/>
+      </w:pPr>
+      <w:r>
+        <w:rPr>
+          <w:rFonts w:ascii="Calibri" w:cs="Calibri" w:hAnsi="Calibri"/>
+          <w:sz w:val="22"/>
+          <w:szCs w:val="22"/>
+          <w:rtl/>
+        </w:rPr>
+        <w:t xml:space="preserve">•  ‏نوع التطبيق: تطبيق ويب يعمل على المتصفح في الحاسوب والهاتف، ويعمل على خوادمنا (Node.js وقاعدة بيانات PostgreSQL).‏</w:t>
+      </w:r>
+    </w:p>
+    <w:p>
+      <w:pPr>
+        <w:bidi/>
+        <w:spacing w:after="120"/>
+        <w:jc w:val="right"/>
+      </w:pPr>
+      <w:r>
+        <w:rPr>
+          <w:rFonts w:ascii="Calibri" w:cs="Calibri" w:hAnsi="Calibri"/>
+          <w:sz w:val="22"/>
+          <w:szCs w:val="22"/>
+          <w:rtl/>
+        </w:rPr>
+        <w:t xml:space="preserve">•  ‏الدخول: نفضّل معيار OpenID Connect أو OAuth 2.0، أو SAML 2.0، مع دعم الإشعار ورمز QR.‏</w:t>
+      </w:r>
+    </w:p>
+    <w:p>
+      <w:pPr>
+        <w:bidi/>
+        <w:spacing w:after="120"/>
+        <w:jc w:val="right"/>
+      </w:pPr>
+      <w:r>
+        <w:rPr>
+          <w:rFonts w:ascii="Calibri" w:cs="Calibri" w:hAnsi="Calibri"/>
+          <w:sz w:val="22"/>
+          <w:szCs w:val="22"/>
+          <w:rtl/>
+        </w:rPr>
+        <w:t xml:space="preserve">•  ‏التوقيع: واجهة برمجية لإرسال طلب توقيع واستلام النتيجة عبر رابط رد (callback)، ونفضّل الحصول على ملف PDF موقّع بصيغة PAdES مع ختم زمني.‏</w:t>
+      </w:r>
+    </w:p>
+    <w:p>
+      <w:pPr>
+        <w:bidi/>
+        <w:spacing w:after="120"/>
+        <w:jc w:val="right"/>
+      </w:pPr>
+      <w:r>
+        <w:rPr>
+          <w:rFonts w:ascii="Calibri" w:cs="Calibri" w:hAnsi="Calibri"/>
+          <w:sz w:val="22"/>
+          <w:szCs w:val="22"/>
+          <w:rtl/>
+        </w:rPr>
+        <w:t xml:space="preserve">•  ‏التحقق: واجهة برمجية للتحقق من التوقيع وحالة الشهادة (OCSP).‏</w:t>
+      </w:r>
+    </w:p>
+    <w:p>
+      <w:pPr>
+        <w:bidi/>
+        <w:spacing w:after="120"/>
+        <w:jc w:val="right"/>
+      </w:pPr>
+      <w:r>
+        <w:rPr>
+          <w:rFonts w:ascii="Calibri" w:cs="Calibri" w:hAnsi="Calibri"/>
+          <w:sz w:val="22"/>
+          <w:szCs w:val="22"/>
+          <w:rtl/>
+        </w:rPr>
+        <w:t xml:space="preserve">•  ‏بيئة اختبار (Sandbox) وحسابات اختبار قبل الانتقال إلى بيئة الإنتاج.‏</w:t>
+      </w:r>
+    </w:p>
+    <w:p>
+      <w:pPr>
+        <w:bidi/>
+        <w:spacing w:after="120"/>
+        <w:jc w:val="right"/>
+      </w:pPr>
+      <w:r>
+        <w:rPr>
+          <w:rFonts w:ascii="Calibri" w:cs="Calibri" w:hAnsi="Calibri"/>
+          <w:sz w:val="22"/>
+          <w:szCs w:val="22"/>
+          <w:rtl/>
+        </w:rPr>
+        <w:t xml:space="preserve">•  ‏نلتزم بأي متطلبات ربط تحددها الوزارة، مثل الشهادات الرقمية للخادم، أو تقييد عناوين IP، أو الاتصال الآمن المتبادل (mTLS).‏</w:t>
       </w:r>
     </w:p>
     <w:p>
@@ -1610,133 +1495,103 @@
           <w:szCs w:val="26"/>
           <w:rtl/>
         </w:rPr>
-        <w:t xml:space="preserve">7. حماية البيانات وأمن المعلومات</w:t>
-      </w:r>
-    </w:p>
-    <w:p>
-      <w:pPr>
-        <w:pStyle w:val="ListParagraph"/>
-        <w:numPr>
-          <w:ilvl w:val="0"/>
-          <w:numId w:val="1"/>
-        </w:numPr>
-        <w:bidi/>
-        <w:spacing w:after="120"/>
-        <w:jc w:val="right"/>
-      </w:pPr>
-      <w:r>
-        <w:rPr>
-          <w:rFonts w:ascii="Calibri" w:cs="Calibri" w:hAnsi="Calibri"/>
-          <w:sz w:val="22"/>
-          <w:szCs w:val="22"/>
-          <w:rtl/>
-        </w:rPr>
-        <w:t xml:space="preserve">نلتزم بقانون حماية البيانات الشخصية الصادر بالمرسوم السلطاني رقم 6/2022 ولائحته التنفيذية، وبقانون المعاملات الإلكترونية الصادر بالمرسوم السلطاني رقم 39/2025.</w:t>
-      </w:r>
-    </w:p>
-    <w:p>
-      <w:pPr>
-        <w:pStyle w:val="ListParagraph"/>
-        <w:numPr>
-          <w:ilvl w:val="0"/>
-          <w:numId w:val="1"/>
-        </w:numPr>
-        <w:bidi/>
-        <w:spacing w:after="120"/>
-        <w:jc w:val="right"/>
-      </w:pPr>
-      <w:r>
-        <w:rPr>
-          <w:rFonts w:ascii="Calibri" w:cs="Calibri" w:hAnsi="Calibri"/>
-          <w:sz w:val="22"/>
-          <w:szCs w:val="22"/>
-          <w:rtl/>
-        </w:rPr>
-        <w:t xml:space="preserve">تُطلب موافقة المستخدم الصريحة قبل مشاركة بياناته من ثقة، وتُستخدم البيانات للغرض المحدد فقط.</w:t>
-      </w:r>
-    </w:p>
-    <w:p>
-      <w:pPr>
-        <w:pStyle w:val="ListParagraph"/>
-        <w:numPr>
-          <w:ilvl w:val="0"/>
-          <w:numId w:val="1"/>
-        </w:numPr>
-        <w:bidi/>
-        <w:spacing w:after="120"/>
-        <w:jc w:val="right"/>
-      </w:pPr>
-      <w:r>
-        <w:rPr>
-          <w:rFonts w:ascii="Calibri" w:cs="Calibri" w:hAnsi="Calibri"/>
-          <w:sz w:val="22"/>
-          <w:szCs w:val="22"/>
-          <w:rtl/>
-        </w:rPr>
-        <w:t xml:space="preserve">جميع الاتصالات مشفرة عبر TLS، وتُخزن مفاتيح الربط والرموز السرية مشفرة (AES-256-GCM).</w:t>
-      </w:r>
-    </w:p>
-    <w:p>
-      <w:pPr>
-        <w:pStyle w:val="ListParagraph"/>
-        <w:numPr>
-          <w:ilvl w:val="0"/>
-          <w:numId w:val="1"/>
-        </w:numPr>
-        <w:bidi/>
-        <w:spacing w:after="120"/>
-        <w:jc w:val="right"/>
-      </w:pPr>
-      <w:r>
-        <w:rPr>
-          <w:rFonts w:ascii="Calibri" w:cs="Calibri" w:hAnsi="Calibri"/>
-          <w:sz w:val="22"/>
-          <w:szCs w:val="22"/>
-          <w:rtl/>
-        </w:rPr>
-        <w:t xml:space="preserve">صلاحيات المستخدمين حسب الدور، وسجل تدقيق لكل عمليات الدخول والتعديل والتنزيل، والتحقق بخطوتين متاح للمستخدمين.</w:t>
-      </w:r>
-    </w:p>
-    <w:p>
-      <w:pPr>
-        <w:pStyle w:val="ListParagraph"/>
-        <w:numPr>
-          <w:ilvl w:val="0"/>
-          <w:numId w:val="1"/>
-        </w:numPr>
-        <w:bidi/>
-        <w:spacing w:after="120"/>
-        <w:jc w:val="right"/>
-      </w:pPr>
-      <w:r>
-        <w:rPr>
-          <w:rFonts w:ascii="Calibri" w:cs="Calibri" w:hAnsi="Calibri"/>
-          <w:sz w:val="22"/>
-          <w:szCs w:val="22"/>
-          <w:rtl/>
-        </w:rPr>
-        <w:t xml:space="preserve">الاستضافة: المنصة مستضافة حالياً على خدمة سحابية خارج سلطنة عُمان، ونخطط لنقل بيانات العملاء العُمانيين إلى مزود استضافة داخل السلطنة. نرجو إفادتنا إن كانت الاستضافة داخل السلطنة شرطاً للربط مع ثقة.</w:t>
-      </w:r>
-    </w:p>
-    <w:p>
-      <w:pPr>
-        <w:pStyle w:val="ListParagraph"/>
-        <w:numPr>
-          <w:ilvl w:val="0"/>
-          <w:numId w:val="1"/>
-        </w:numPr>
-        <w:bidi/>
-        <w:spacing w:after="120"/>
-        <w:jc w:val="right"/>
-      </w:pPr>
-      <w:r>
-        <w:rPr>
-          <w:rFonts w:ascii="Calibri" w:cs="Calibri" w:hAnsi="Calibri"/>
-          <w:sz w:val="22"/>
-          <w:szCs w:val="22"/>
-          <w:rtl/>
-        </w:rPr>
-        <w:t xml:space="preserve">نحن مستعدون لإجراء تقييم أمني أو اختبار اختراق تطلبه الوزارة قبل الانتقال إلى الإنتاج.</w:t>
+        <w:t xml:space="preserve">‏7. حماية البيانات وأمن المعلومات‏</w:t>
+      </w:r>
+    </w:p>
+    <w:p>
+      <w:pPr>
+        <w:bidi/>
+        <w:spacing w:after="120"/>
+        <w:jc w:val="right"/>
+      </w:pPr>
+      <w:r>
+        <w:rPr>
+          <w:rFonts w:ascii="Calibri" w:cs="Calibri" w:hAnsi="Calibri"/>
+          <w:sz w:val="22"/>
+          <w:szCs w:val="22"/>
+          <w:rtl/>
+        </w:rPr>
+        <w:t xml:space="preserve">•  ‏نلتزم بقانون حماية البيانات الشخصية الصادر بالمرسوم السلطاني رقم 6/2022 ولائحته التنفيذية، وبقانون المعاملات الإلكترونية الصادر بالمرسوم السلطاني رقم 39/2025.‏</w:t>
+      </w:r>
+    </w:p>
+    <w:p>
+      <w:pPr>
+        <w:bidi/>
+        <w:spacing w:after="120"/>
+        <w:jc w:val="right"/>
+      </w:pPr>
+      <w:r>
+        <w:rPr>
+          <w:rFonts w:ascii="Calibri" w:cs="Calibri" w:hAnsi="Calibri"/>
+          <w:sz w:val="22"/>
+          <w:szCs w:val="22"/>
+          <w:rtl/>
+        </w:rPr>
+        <w:t xml:space="preserve">•  ‏تُطلب موافقة المستخدم الصريحة قبل مشاركة بياناته من ثقة، وتُستخدم البيانات للغرض المحدد فقط.‏</w:t>
+      </w:r>
+    </w:p>
+    <w:p>
+      <w:pPr>
+        <w:bidi/>
+        <w:spacing w:after="120"/>
+        <w:jc w:val="right"/>
+      </w:pPr>
+      <w:r>
+        <w:rPr>
+          <w:rFonts w:ascii="Calibri" w:cs="Calibri" w:hAnsi="Calibri"/>
+          <w:sz w:val="22"/>
+          <w:szCs w:val="22"/>
+          <w:rtl/>
+        </w:rPr>
+        <w:t xml:space="preserve">•  ‏جميع الاتصالات مشفرة عبر TLS، وتُخزن مفاتيح الربط والرموز السرية مشفرة (AES-256-GCM).‏</w:t>
+      </w:r>
+    </w:p>
+    <w:p>
+      <w:pPr>
+        <w:bidi/>
+        <w:spacing w:after="120"/>
+        <w:jc w:val="right"/>
+      </w:pPr>
+      <w:r>
+        <w:rPr>
+          <w:rFonts w:ascii="Calibri" w:cs="Calibri" w:hAnsi="Calibri"/>
+          <w:sz w:val="22"/>
+          <w:szCs w:val="22"/>
+          <w:rtl/>
+        </w:rPr>
+        <w:t xml:space="preserve">•  ‏صلاحيات المستخدمين حسب الدور، وسجل تدقيق لكل عمليات الدخول والتعديل والتنزيل، والتحقق بخطوتين متاح للمستخدمين.‏</w:t>
+      </w:r>
+    </w:p>
+    <w:p>
+      <w:pPr>
+        <w:bidi/>
+        <w:spacing w:after="120"/>
+        <w:jc w:val="right"/>
+      </w:pPr>
+      <w:r>
+        <w:rPr>
+          <w:rFonts w:ascii="Calibri" w:cs="Calibri" w:hAnsi="Calibri"/>
+          <w:sz w:val="22"/>
+          <w:szCs w:val="22"/>
+          <w:rtl/>
+        </w:rPr>
+        <w:t xml:space="preserve">•  ‏الاستضافة: المنصة مستضافة حالياً على خدمة سحابية خارج سلطنة عُمان، ونخطط لنقل بيانات العملاء العُمانيين إلى مزود استضافة داخل السلطنة. نرجو إفادتنا إن كانت الاستضافة داخل السلطنة شرطاً للربط مع ثقة.‏</w:t>
+      </w:r>
+    </w:p>
+    <w:p>
+      <w:pPr>
+        <w:bidi/>
+        <w:spacing w:after="120"/>
+        <w:jc w:val="right"/>
+      </w:pPr>
+      <w:r>
+        <w:rPr>
+          <w:rFonts w:ascii="Calibri" w:cs="Calibri" w:hAnsi="Calibri"/>
+          <w:sz w:val="22"/>
+          <w:szCs w:val="22"/>
+          <w:rtl/>
+        </w:rPr>
+        <w:t xml:space="preserve">•  ‏نحن مستعدون لإجراء تقييم أمني أو اختبار اختراق تطلبه الوزارة قبل الانتقال إلى الإنتاج.‏</w:t>
       </w:r>
     </w:p>
     <w:p>
@@ -1754,7 +1609,7 @@
           <w:szCs w:val="26"/>
           <w:rtl/>
         </w:rPr>
-        <w:t xml:space="preserve">8. الحجم المتوقع والجدول الزمني</w:t>
+        <w:t xml:space="preserve">‏8. الحجم المتوقع والجدول الزمني‏</w:t>
       </w:r>
     </w:p>
     <w:tbl>
@@ -1801,7 +1656,7 @@
                 <w:szCs w:val="21"/>
                 <w:rtl/>
               </w:rPr>
-              <w:t xml:space="preserve">البند</w:t>
+              <w:t xml:space="preserve">‏البند‏</w:t>
             </w:r>
           </w:p>
         </w:tc>
@@ -1831,7 +1686,7 @@
                 <w:szCs w:val="21"/>
                 <w:rtl/>
               </w:rPr>
-              <w:t xml:space="preserve">التقدير</w:t>
+              <w:t xml:space="preserve">‏التقدير‏</w:t>
             </w:r>
           </w:p>
         </w:tc>
@@ -1861,7 +1716,7 @@
                 <w:szCs w:val="21"/>
                 <w:rtl/>
               </w:rPr>
-              <w:t xml:space="preserve">عدد المكاتب في المرحلة الأولى</w:t>
+              <w:t xml:space="preserve">‏عدد المكاتب في المرحلة الأولى‏</w:t>
             </w:r>
           </w:p>
         </w:tc>
@@ -1889,7 +1744,7 @@
                 <w:szCs w:val="21"/>
                 <w:rtl/>
               </w:rPr>
-              <w:t xml:space="preserve">[عدد]</w:t>
+              <w:t xml:space="preserve">‏[عدد]‏</w:t>
             </w:r>
           </w:p>
         </w:tc>
@@ -1919,7 +1774,7 @@
                 <w:szCs w:val="21"/>
                 <w:rtl/>
               </w:rPr>
-              <w:t xml:space="preserve">عدد المستخدمين المتوقع خلال السنة الأولى</w:t>
+              <w:t xml:space="preserve">‏عدد المستخدمين المتوقع خلال السنة الأولى‏</w:t>
             </w:r>
           </w:p>
         </w:tc>
@@ -1947,7 +1802,7 @@
                 <w:szCs w:val="21"/>
                 <w:rtl/>
               </w:rPr>
-              <w:t xml:space="preserve">[عدد]</w:t>
+              <w:t xml:space="preserve">‏[عدد]‏</w:t>
             </w:r>
           </w:p>
         </w:tc>
@@ -1977,7 +1832,7 @@
                 <w:szCs w:val="21"/>
                 <w:rtl/>
               </w:rPr>
-              <w:t xml:space="preserve">عمليات الدخول شهرياً</w:t>
+              <w:t xml:space="preserve">‏عمليات الدخول شهرياً‏</w:t>
             </w:r>
           </w:p>
         </w:tc>
@@ -2005,7 +1860,7 @@
                 <w:szCs w:val="21"/>
                 <w:rtl/>
               </w:rPr>
-              <w:t xml:space="preserve">[عدد]</w:t>
+              <w:t xml:space="preserve">‏[عدد]‏</w:t>
             </w:r>
           </w:p>
         </w:tc>
@@ -2035,7 +1890,7 @@
                 <w:szCs w:val="21"/>
                 <w:rtl/>
               </w:rPr>
-              <w:t xml:space="preserve">عمليات التوقيع شهرياً</w:t>
+              <w:t xml:space="preserve">‏عمليات التوقيع شهرياً‏</w:t>
             </w:r>
           </w:p>
         </w:tc>
@@ -2063,7 +1918,7 @@
                 <w:szCs w:val="21"/>
                 <w:rtl/>
               </w:rPr>
-              <w:t xml:space="preserve">[عدد]</w:t>
+              <w:t xml:space="preserve">‏[عدد]‏</w:t>
             </w:r>
           </w:p>
         </w:tc>
@@ -2093,7 +1948,7 @@
                 <w:szCs w:val="21"/>
                 <w:rtl/>
               </w:rPr>
-              <w:t xml:space="preserve">الربط في بيئة الاختبار</w:t>
+              <w:t xml:space="preserve">‏الربط في بيئة الاختبار‏</w:t>
             </w:r>
           </w:p>
         </w:tc>
@@ -2121,7 +1976,7 @@
                 <w:szCs w:val="21"/>
                 <w:rtl/>
               </w:rPr>
-              <w:t xml:space="preserve">خلال [عدد] أسابيع من استلام الوثائق</w:t>
+              <w:t xml:space="preserve">‏خلال [عدد] أسابيع من استلام الوثائق‏</w:t>
             </w:r>
           </w:p>
         </w:tc>
@@ -2151,7 +2006,7 @@
                 <w:szCs w:val="21"/>
                 <w:rtl/>
               </w:rPr>
-              <w:t xml:space="preserve">الإطلاق التجريبي مع مكاتب مختارة</w:t>
+              <w:t xml:space="preserve">‏الإطلاق التجريبي مع مكاتب مختارة‏</w:t>
             </w:r>
           </w:p>
         </w:tc>
@@ -2179,7 +2034,7 @@
                 <w:szCs w:val="21"/>
                 <w:rtl/>
               </w:rPr>
-              <w:t xml:space="preserve">[الشهر والسنة]</w:t>
+              <w:t xml:space="preserve">‏[الشهر والسنة]‏</w:t>
             </w:r>
           </w:p>
         </w:tc>
@@ -2216,91 +2071,71 @@
           <w:szCs w:val="26"/>
           <w:rtl/>
         </w:rPr>
-        <w:t xml:space="preserve">9. ما نطلبه من الوزارة</w:t>
-      </w:r>
-    </w:p>
-    <w:p>
-      <w:pPr>
-        <w:pStyle w:val="ListParagraph"/>
-        <w:numPr>
-          <w:ilvl w:val="0"/>
-          <w:numId w:val="1"/>
-        </w:numPr>
-        <w:bidi/>
-        <w:spacing w:after="120"/>
-        <w:jc w:val="right"/>
-      </w:pPr>
-      <w:r>
-        <w:rPr>
-          <w:rFonts w:ascii="Calibri" w:cs="Calibri" w:hAnsi="Calibri"/>
-          <w:sz w:val="22"/>
-          <w:szCs w:val="22"/>
-          <w:rtl/>
-        </w:rPr>
-        <w:t xml:space="preserve">وثائق الربط الفني لخدمات الدخول والتوقيع والتحقق.</w:t>
-      </w:r>
-    </w:p>
-    <w:p>
-      <w:pPr>
-        <w:pStyle w:val="ListParagraph"/>
-        <w:numPr>
-          <w:ilvl w:val="0"/>
-          <w:numId w:val="1"/>
-        </w:numPr>
-        <w:bidi/>
-        <w:spacing w:after="120"/>
-        <w:jc w:val="right"/>
-      </w:pPr>
-      <w:r>
-        <w:rPr>
-          <w:rFonts w:ascii="Calibri" w:cs="Calibri" w:hAnsi="Calibri"/>
-          <w:sz w:val="22"/>
-          <w:szCs w:val="22"/>
-          <w:rtl/>
-        </w:rPr>
-        <w:t xml:space="preserve">الوصول إلى بيئة الاختبار وحسابات الاختبار ومفاتيح الربط.</w:t>
-      </w:r>
-    </w:p>
-    <w:p>
-      <w:pPr>
-        <w:pStyle w:val="ListParagraph"/>
-        <w:numPr>
-          <w:ilvl w:val="0"/>
-          <w:numId w:val="1"/>
-        </w:numPr>
-        <w:bidi/>
-        <w:spacing w:after="120"/>
-        <w:jc w:val="right"/>
-      </w:pPr>
-      <w:r>
-        <w:rPr>
-          <w:rFonts w:ascii="Calibri" w:cs="Calibri" w:hAnsi="Calibri"/>
-          <w:sz w:val="22"/>
-          <w:szCs w:val="22"/>
-          <w:rtl/>
-        </w:rPr>
-        <w:t xml:space="preserve">نموذج الاتفاقية والرسوم إن وجدت، والمتطلبات الأمنية والنظامية للجهات الخاصة.</w:t>
-      </w:r>
-    </w:p>
-    <w:p>
-      <w:pPr>
-        <w:pStyle w:val="ListParagraph"/>
-        <w:numPr>
-          <w:ilvl w:val="0"/>
-          <w:numId w:val="1"/>
-        </w:numPr>
-        <w:bidi/>
-        <w:spacing w:after="120"/>
-        <w:jc w:val="right"/>
-      </w:pPr>
-      <w:r>
-        <w:rPr>
-          <w:rFonts w:ascii="Calibri" w:cs="Calibri" w:hAnsi="Calibri"/>
-          <w:sz w:val="22"/>
-          <w:szCs w:val="22"/>
-          <w:rtl/>
-        </w:rPr>
-        <w:t xml:space="preserve">إفادتنا بشأن شرط الاستضافة داخل السلطنة.</w:t>
+        <w:t xml:space="preserve">‏9. ما نطلبه من الوزارة‏</w:t>
+      </w:r>
+    </w:p>
+    <w:p>
+      <w:pPr>
+        <w:bidi/>
+        <w:spacing w:after="120"/>
+        <w:jc w:val="right"/>
+      </w:pPr>
+      <w:r>
+        <w:rPr>
+          <w:rFonts w:ascii="Calibri" w:cs="Calibri" w:hAnsi="Calibri"/>
+          <w:sz w:val="22"/>
+          <w:szCs w:val="22"/>
+          <w:rtl/>
+        </w:rPr>
+        <w:t xml:space="preserve">•  ‏وثائق الربط الفني لخدمات الدخول والتوقيع والتحقق.‏</w:t>
+      </w:r>
+    </w:p>
+    <w:p>
+      <w:pPr>
+        <w:bidi/>
+        <w:spacing w:after="120"/>
+        <w:jc w:val="right"/>
+      </w:pPr>
+      <w:r>
+        <w:rPr>
+          <w:rFonts w:ascii="Calibri" w:cs="Calibri" w:hAnsi="Calibri"/>
+          <w:sz w:val="22"/>
+          <w:szCs w:val="22"/>
+          <w:rtl/>
+        </w:rPr>
+        <w:t xml:space="preserve">•  ‏الوصول إلى بيئة الاختبار وحسابات الاختبار ومفاتيح الربط.‏</w:t>
+      </w:r>
+    </w:p>
+    <w:p>
+      <w:pPr>
+        <w:bidi/>
+        <w:spacing w:after="120"/>
+        <w:jc w:val="right"/>
+      </w:pPr>
+      <w:r>
+        <w:rPr>
+          <w:rFonts w:ascii="Calibri" w:cs="Calibri" w:hAnsi="Calibri"/>
+          <w:sz w:val="22"/>
+          <w:szCs w:val="22"/>
+          <w:rtl/>
+        </w:rPr>
+        <w:t xml:space="preserve">•  ‏نموذج الاتفاقية والرسوم إن وجدت، والمتطلبات الأمنية والنظامية للجهات الخاصة.‏</w:t>
+      </w:r>
+    </w:p>
+    <w:p>
+      <w:pPr>
+        <w:bidi/>
+        <w:spacing w:after="120"/>
+        <w:jc w:val="right"/>
+      </w:pPr>
+      <w:r>
+        <w:rPr>
+          <w:rFonts w:ascii="Calibri" w:cs="Calibri" w:hAnsi="Calibri"/>
+          <w:sz w:val="22"/>
+          <w:szCs w:val="22"/>
+          <w:rtl/>
+        </w:rPr>
+        <w:t xml:space="preserve">•  ‏إفادتنا بشأن شرط الاستضافة داخل السلطنة.‏</w:t>
       </w:r>
     </w:p>
     <w:p>
@@ -2318,55 +2153,55 @@
           <w:szCs w:val="26"/>
           <w:rtl/>
         </w:rPr>
-        <w:t xml:space="preserve">10. التواصل</w:t>
-      </w:r>
-    </w:p>
-    <w:p>
-      <w:pPr>
-        <w:bidi/>
-        <w:spacing w:after="120"/>
-        <w:jc w:val="right"/>
-      </w:pPr>
-      <w:r>
-        <w:rPr>
-          <w:rFonts w:ascii="Calibri" w:cs="Calibri" w:hAnsi="Calibri"/>
-          <w:sz w:val="22"/>
-          <w:szCs w:val="22"/>
-          <w:rtl/>
-        </w:rPr>
-        <w:t xml:space="preserve">[الاسم]، [المسمى الوظيفي]</w:t>
-      </w:r>
-    </w:p>
-    <w:p>
-      <w:pPr>
-        <w:bidi/>
-        <w:spacing w:after="120"/>
-        <w:jc w:val="right"/>
-      </w:pPr>
-      <w:r>
-        <w:rPr>
-          <w:rFonts w:ascii="Calibri" w:cs="Calibri" w:hAnsi="Calibri"/>
-          <w:sz w:val="22"/>
-          <w:szCs w:val="22"/>
-          <w:rtl/>
-        </w:rPr>
-        <w:t xml:space="preserve">[الشركة]</w:t>
-      </w:r>
-    </w:p>
-    <w:p>
-      <w:pPr>
-        <w:bidi/>
-        <w:spacing w:after="120"/>
-        <w:jc w:val="right"/>
-      </w:pPr>
-      <w:r>
-        <w:rPr>
-          <w:rFonts w:ascii="Calibri" w:cs="Calibri" w:hAnsi="Calibri"/>
-          <w:sz w:val="22"/>
-          <w:szCs w:val="22"/>
-          <w:rtl/>
-        </w:rPr>
-        <w:t xml:space="preserve">[الهاتف]، [البريد الإلكتروني]</w:t>
+        <w:t xml:space="preserve">‏10. التواصل‏</w:t>
+      </w:r>
+    </w:p>
+    <w:p>
+      <w:pPr>
+        <w:bidi/>
+        <w:spacing w:after="120"/>
+        <w:jc w:val="right"/>
+      </w:pPr>
+      <w:r>
+        <w:rPr>
+          <w:rFonts w:ascii="Calibri" w:cs="Calibri" w:hAnsi="Calibri"/>
+          <w:sz w:val="22"/>
+          <w:szCs w:val="22"/>
+          <w:rtl/>
+        </w:rPr>
+        <w:t xml:space="preserve">‏[الاسم]، [المسمى الوظيفي]‏</w:t>
+      </w:r>
+    </w:p>
+    <w:p>
+      <w:pPr>
+        <w:bidi/>
+        <w:spacing w:after="120"/>
+        <w:jc w:val="right"/>
+      </w:pPr>
+      <w:r>
+        <w:rPr>
+          <w:rFonts w:ascii="Calibri" w:cs="Calibri" w:hAnsi="Calibri"/>
+          <w:sz w:val="22"/>
+          <w:szCs w:val="22"/>
+          <w:rtl/>
+        </w:rPr>
+        <w:t xml:space="preserve">‏[الشركة]‏</w:t>
+      </w:r>
+    </w:p>
+    <w:p>
+      <w:pPr>
+        <w:bidi/>
+        <w:spacing w:after="120"/>
+        <w:jc w:val="right"/>
+      </w:pPr>
+      <w:r>
+        <w:rPr>
+          <w:rFonts w:ascii="Calibri" w:cs="Calibri" w:hAnsi="Calibri"/>
+          <w:sz w:val="22"/>
+          <w:szCs w:val="22"/>
+          <w:rtl/>
+        </w:rPr>
+        <w:t xml:space="preserve">‏[الهاتف]، [البريد الإلكتروني]‏</w:t>
       </w:r>
     </w:p>
     <w:p>
@@ -3016,86 +2851,66 @@
     </w:p>
     <w:p>
       <w:pPr>
-        <w:pStyle w:val="ListParagraph"/>
-        <w:numPr>
-          <w:ilvl w:val="0"/>
-          <w:numId w:val="1"/>
-        </w:numPr>
-        <w:bidi w:val="false"/>
-        <w:spacing w:after="120"/>
-        <w:jc w:val="left"/>
-      </w:pPr>
-      <w:r>
-        <w:rPr>
-          <w:rFonts w:ascii="Calibri" w:cs="Calibri" w:hAnsi="Calibri"/>
-          <w:sz w:val="22"/>
-          <w:szCs w:val="22"/>
-          <w:rtl w:val="false"/>
-        </w:rPr>
-        <w:t xml:space="preserve">Identity portal (unified sign-in): lawyers, staff and clients sign in to the platform with the THEQA app or their ID card.</w:t>
-      </w:r>
-    </w:p>
-    <w:p>
-      <w:pPr>
-        <w:pStyle w:val="ListParagraph"/>
-        <w:numPr>
-          <w:ilvl w:val="0"/>
-          <w:numId w:val="1"/>
-        </w:numPr>
-        <w:bidi w:val="false"/>
-        <w:spacing w:after="120"/>
-        <w:jc w:val="left"/>
-      </w:pPr>
-      <w:r>
-        <w:rPr>
-          <w:rFonts w:ascii="Calibri" w:cs="Calibri" w:hAnsi="Calibri"/>
-          <w:sz w:val="22"/>
-          <w:szCs w:val="22"/>
-          <w:rtl w:val="false"/>
-        </w:rPr>
-        <w:t xml:space="preserve">Client identity verification: verifying a new client's identity when a firm opens their file, instead of uploading a photo of the ID card.</w:t>
-      </w:r>
-    </w:p>
-    <w:p>
-      <w:pPr>
-        <w:pStyle w:val="ListParagraph"/>
-        <w:numPr>
-          <w:ilvl w:val="0"/>
-          <w:numId w:val="1"/>
-        </w:numPr>
-        <w:bidi w:val="false"/>
-        <w:spacing w:after="120"/>
-        <w:jc w:val="left"/>
-      </w:pPr>
-      <w:r>
-        <w:rPr>
-          <w:rFonts w:ascii="Calibri" w:cs="Calibri" w:hAnsi="Calibri"/>
-          <w:sz w:val="22"/>
-          <w:szCs w:val="22"/>
-          <w:rtl w:val="false"/>
-        </w:rPr>
-        <w:t xml:space="preserve">Certified electronic signature: signing legal documents electronically through the digital signature portal.</w:t>
-      </w:r>
-    </w:p>
-    <w:p>
-      <w:pPr>
-        <w:pStyle w:val="ListParagraph"/>
-        <w:numPr>
-          <w:ilvl w:val="0"/>
-          <w:numId w:val="1"/>
-        </w:numPr>
-        <w:bidi w:val="false"/>
-        <w:spacing w:after="120"/>
-        <w:jc w:val="left"/>
-      </w:pPr>
-      <w:r>
-        <w:rPr>
-          <w:rFonts w:ascii="Calibri" w:cs="Calibri" w:hAnsi="Calibri"/>
-          <w:sz w:val="22"/>
-          <w:szCs w:val="22"/>
-          <w:rtl w:val="false"/>
-        </w:rPr>
-        <w:t xml:space="preserve">Signature verification: checking the validity of digital signatures on documents a firm receives.</w:t>
+        <w:bidi w:val="false"/>
+        <w:spacing w:after="120"/>
+        <w:jc w:val="left"/>
+      </w:pPr>
+      <w:r>
+        <w:rPr>
+          <w:rFonts w:ascii="Calibri" w:cs="Calibri" w:hAnsi="Calibri"/>
+          <w:sz w:val="22"/>
+          <w:szCs w:val="22"/>
+          <w:rtl w:val="false"/>
+        </w:rPr>
+        <w:t xml:space="preserve">•  Identity portal (unified sign-in): lawyers, staff and clients sign in to the platform with the THEQA app or their ID card.</w:t>
+      </w:r>
+    </w:p>
+    <w:p>
+      <w:pPr>
+        <w:bidi w:val="false"/>
+        <w:spacing w:after="120"/>
+        <w:jc w:val="left"/>
+      </w:pPr>
+      <w:r>
+        <w:rPr>
+          <w:rFonts w:ascii="Calibri" w:cs="Calibri" w:hAnsi="Calibri"/>
+          <w:sz w:val="22"/>
+          <w:szCs w:val="22"/>
+          <w:rtl w:val="false"/>
+        </w:rPr>
+        <w:t xml:space="preserve">•  Client identity verification: verifying a new client's identity when a firm opens their file, instead of uploading a photo of the ID card.</w:t>
+      </w:r>
+    </w:p>
+    <w:p>
+      <w:pPr>
+        <w:bidi w:val="false"/>
+        <w:spacing w:after="120"/>
+        <w:jc w:val="left"/>
+      </w:pPr>
+      <w:r>
+        <w:rPr>
+          <w:rFonts w:ascii="Calibri" w:cs="Calibri" w:hAnsi="Calibri"/>
+          <w:sz w:val="22"/>
+          <w:szCs w:val="22"/>
+          <w:rtl w:val="false"/>
+        </w:rPr>
+        <w:t xml:space="preserve">•  Certified electronic signature: signing legal documents electronically through the digital signature portal.</w:t>
+      </w:r>
+    </w:p>
+    <w:p>
+      <w:pPr>
+        <w:bidi w:val="false"/>
+        <w:spacing w:after="120"/>
+        <w:jc w:val="left"/>
+      </w:pPr>
+      <w:r>
+        <w:rPr>
+          <w:rFonts w:ascii="Calibri" w:cs="Calibri" w:hAnsi="Calibri"/>
+          <w:sz w:val="22"/>
+          <w:szCs w:val="22"/>
+          <w:rtl w:val="false"/>
+        </w:rPr>
+        <w:t xml:space="preserve">•  Signature verification: checking the validity of digital signatures on documents a firm receives.</w:t>
       </w:r>
     </w:p>
     <w:p>
@@ -3136,86 +2951,66 @@
     </w:p>
     <w:p>
       <w:pPr>
-        <w:pStyle w:val="ListParagraph"/>
-        <w:numPr>
-          <w:ilvl w:val="0"/>
-          <w:numId w:val="1"/>
-        </w:numPr>
-        <w:bidi w:val="false"/>
-        <w:spacing w:after="120"/>
-        <w:jc w:val="left"/>
-      </w:pPr>
-      <w:r>
-        <w:rPr>
-          <w:rFonts w:ascii="Calibri" w:cs="Calibri" w:hAnsi="Calibri"/>
-          <w:sz w:val="22"/>
-          <w:szCs w:val="22"/>
-          <w:rtl w:val="false"/>
-        </w:rPr>
-        <w:t xml:space="preserve">The user chooses "Sign in with THEQA" on the sign-in page.</w:t>
-      </w:r>
-    </w:p>
-    <w:p>
-      <w:pPr>
-        <w:pStyle w:val="ListParagraph"/>
-        <w:numPr>
-          <w:ilvl w:val="0"/>
-          <w:numId w:val="1"/>
-        </w:numPr>
-        <w:bidi w:val="false"/>
-        <w:spacing w:after="120"/>
-        <w:jc w:val="left"/>
-      </w:pPr>
-      <w:r>
-        <w:rPr>
-          <w:rFonts w:ascii="Calibri" w:cs="Calibri" w:hAnsi="Calibri"/>
-          <w:sz w:val="22"/>
-          <w:szCs w:val="22"/>
-          <w:rtl w:val="false"/>
-        </w:rPr>
-        <w:t xml:space="preserve">They approve the request through the push notification in the THEQA app or by scanning a QR code, then enter their PIN.</w:t>
-      </w:r>
-    </w:p>
-    <w:p>
-      <w:pPr>
-        <w:pStyle w:val="ListParagraph"/>
-        <w:numPr>
-          <w:ilvl w:val="0"/>
-          <w:numId w:val="1"/>
-        </w:numPr>
-        <w:bidi w:val="false"/>
-        <w:spacing w:after="120"/>
-        <w:jc w:val="left"/>
-      </w:pPr>
-      <w:r>
-        <w:rPr>
-          <w:rFonts w:ascii="Calibri" w:cs="Calibri" w:hAnsi="Calibri"/>
-          <w:sz w:val="22"/>
-          <w:szCs w:val="22"/>
-          <w:rtl w:val="false"/>
-        </w:rPr>
-        <w:t xml:space="preserve">The platform links the identity to the user's existing account in their firm; it does not create accounts automatically.</w:t>
-      </w:r>
-    </w:p>
-    <w:p>
-      <w:pPr>
-        <w:pStyle w:val="ListParagraph"/>
-        <w:numPr>
-          <w:ilvl w:val="0"/>
-          <w:numId w:val="1"/>
-        </w:numPr>
-        <w:bidi w:val="false"/>
-        <w:spacing w:after="120"/>
-        <w:jc w:val="left"/>
-      </w:pPr>
-      <w:r>
-        <w:rPr>
-          <w:rFonts w:ascii="Calibri" w:cs="Calibri" w:hAnsi="Calibri"/>
-          <w:sz w:val="22"/>
-          <w:szCs w:val="22"/>
-          <w:rtl w:val="false"/>
-        </w:rPr>
-        <w:t xml:space="preserve">At least the medium verification level is used.</w:t>
+        <w:bidi w:val="false"/>
+        <w:spacing w:after="120"/>
+        <w:jc w:val="left"/>
+      </w:pPr>
+      <w:r>
+        <w:rPr>
+          <w:rFonts w:ascii="Calibri" w:cs="Calibri" w:hAnsi="Calibri"/>
+          <w:sz w:val="22"/>
+          <w:szCs w:val="22"/>
+          <w:rtl w:val="false"/>
+        </w:rPr>
+        <w:t xml:space="preserve">•  The user chooses "Sign in with THEQA" on the sign-in page.</w:t>
+      </w:r>
+    </w:p>
+    <w:p>
+      <w:pPr>
+        <w:bidi w:val="false"/>
+        <w:spacing w:after="120"/>
+        <w:jc w:val="left"/>
+      </w:pPr>
+      <w:r>
+        <w:rPr>
+          <w:rFonts w:ascii="Calibri" w:cs="Calibri" w:hAnsi="Calibri"/>
+          <w:sz w:val="22"/>
+          <w:szCs w:val="22"/>
+          <w:rtl w:val="false"/>
+        </w:rPr>
+        <w:t xml:space="preserve">•  They approve the request through the push notification in the THEQA app or by scanning a QR code, then enter their PIN.</w:t>
+      </w:r>
+    </w:p>
+    <w:p>
+      <w:pPr>
+        <w:bidi w:val="false"/>
+        <w:spacing w:after="120"/>
+        <w:jc w:val="left"/>
+      </w:pPr>
+      <w:r>
+        <w:rPr>
+          <w:rFonts w:ascii="Calibri" w:cs="Calibri" w:hAnsi="Calibri"/>
+          <w:sz w:val="22"/>
+          <w:szCs w:val="22"/>
+          <w:rtl w:val="false"/>
+        </w:rPr>
+        <w:t xml:space="preserve">•  The platform links the identity to the user's existing account in their firm; it does not create accounts automatically.</w:t>
+      </w:r>
+    </w:p>
+    <w:p>
+      <w:pPr>
+        <w:bidi w:val="false"/>
+        <w:spacing w:after="120"/>
+        <w:jc w:val="left"/>
+      </w:pPr>
+      <w:r>
+        <w:rPr>
+          <w:rFonts w:ascii="Calibri" w:cs="Calibri" w:hAnsi="Calibri"/>
+          <w:sz w:val="22"/>
+          <w:szCs w:val="22"/>
+          <w:rtl w:val="false"/>
+        </w:rPr>
+        <w:t xml:space="preserve">•  At least the medium verification level is used.</w:t>
       </w:r>
     </w:p>
     <w:p>
@@ -3238,65 +3033,50 @@
     </w:p>
     <w:p>
       <w:pPr>
-        <w:pStyle w:val="ListParagraph"/>
-        <w:numPr>
-          <w:ilvl w:val="0"/>
-          <w:numId w:val="1"/>
-        </w:numPr>
-        <w:bidi w:val="false"/>
-        <w:spacing w:after="120"/>
-        <w:jc w:val="left"/>
-      </w:pPr>
-      <w:r>
-        <w:rPr>
-          <w:rFonts w:ascii="Calibri" w:cs="Calibri" w:hAnsi="Calibri"/>
-          <w:sz w:val="22"/>
-          <w:szCs w:val="22"/>
-          <w:rtl w:val="false"/>
-        </w:rPr>
-        <w:t xml:space="preserve">When opening a new client file, the firm sends the client a link to verify their identity with THEQA.</w:t>
-      </w:r>
-    </w:p>
-    <w:p>
-      <w:pPr>
-        <w:pStyle w:val="ListParagraph"/>
-        <w:numPr>
-          <w:ilvl w:val="0"/>
-          <w:numId w:val="1"/>
-        </w:numPr>
-        <w:bidi w:val="false"/>
-        <w:spacing w:after="120"/>
-        <w:jc w:val="left"/>
-      </w:pPr>
-      <w:r>
-        <w:rPr>
-          <w:rFonts w:ascii="Calibri" w:cs="Calibri" w:hAnsi="Calibri"/>
-          <w:sz w:val="22"/>
-          <w:szCs w:val="22"/>
-          <w:rtl w:val="false"/>
-        </w:rPr>
-        <w:t xml:space="preserve">The platform stores the result, its time, and only the data the client agrees to share, in the firm's know-your-client record.</w:t>
-      </w:r>
-    </w:p>
-    <w:p>
-      <w:pPr>
-        <w:pStyle w:val="ListParagraph"/>
-        <w:numPr>
-          <w:ilvl w:val="0"/>
-          <w:numId w:val="1"/>
-        </w:numPr>
-        <w:bidi w:val="false"/>
-        <w:spacing w:after="120"/>
-        <w:jc w:val="left"/>
-      </w:pPr>
-      <w:r>
-        <w:rPr>
-          <w:rFonts w:ascii="Calibri" w:cs="Calibri" w:hAnsi="Calibri"/>
-          <w:sz w:val="22"/>
-          <w:szCs w:val="22"/>
-          <w:rtl w:val="false"/>
-        </w:rPr>
-        <w:t xml:space="preserve">This supports firms' obligations to verify their clients' identity.</w:t>
+        <w:bidi w:val="false"/>
+        <w:spacing w:after="120"/>
+        <w:jc w:val="left"/>
+      </w:pPr>
+      <w:r>
+        <w:rPr>
+          <w:rFonts w:ascii="Calibri" w:cs="Calibri" w:hAnsi="Calibri"/>
+          <w:sz w:val="22"/>
+          <w:szCs w:val="22"/>
+          <w:rtl w:val="false"/>
+        </w:rPr>
+        <w:t xml:space="preserve">•  When opening a new client file, the firm sends the client a link to verify their identity with THEQA.</w:t>
+      </w:r>
+    </w:p>
+    <w:p>
+      <w:pPr>
+        <w:bidi w:val="false"/>
+        <w:spacing w:after="120"/>
+        <w:jc w:val="left"/>
+      </w:pPr>
+      <w:r>
+        <w:rPr>
+          <w:rFonts w:ascii="Calibri" w:cs="Calibri" w:hAnsi="Calibri"/>
+          <w:sz w:val="22"/>
+          <w:szCs w:val="22"/>
+          <w:rtl w:val="false"/>
+        </w:rPr>
+        <w:t xml:space="preserve">•  The platform stores the result, its time, and only the data the client agrees to share, in the firm's know-your-client record.</w:t>
+      </w:r>
+    </w:p>
+    <w:p>
+      <w:pPr>
+        <w:bidi w:val="false"/>
+        <w:spacing w:after="120"/>
+        <w:jc w:val="left"/>
+      </w:pPr>
+      <w:r>
+        <w:rPr>
+          <w:rFonts w:ascii="Calibri" w:cs="Calibri" w:hAnsi="Calibri"/>
+          <w:sz w:val="22"/>
+          <w:szCs w:val="22"/>
+          <w:rtl w:val="false"/>
+        </w:rPr>
+        <w:t xml:space="preserve">•  This supports firms' obligations to verify their clients' identity.</w:t>
       </w:r>
     </w:p>
     <w:p>
@@ -3319,107 +3099,82 @@
     </w:p>
     <w:p>
       <w:pPr>
-        <w:pStyle w:val="ListParagraph"/>
-        <w:numPr>
-          <w:ilvl w:val="0"/>
-          <w:numId w:val="1"/>
-        </w:numPr>
-        <w:bidi w:val="false"/>
-        <w:spacing w:after="120"/>
-        <w:jc w:val="left"/>
-      </w:pPr>
-      <w:r>
-        <w:rPr>
-          <w:rFonts w:ascii="Calibri" w:cs="Calibri" w:hAnsi="Calibri"/>
-          <w:sz w:val="22"/>
-          <w:szCs w:val="22"/>
-          <w:rtl w:val="false"/>
-        </w:rPr>
-        <w:t xml:space="preserve">Example documents: fee agreements and engagement letters, settlement agreements, client acknowledgments and internal minutes.</w:t>
-      </w:r>
-    </w:p>
-    <w:p>
-      <w:pPr>
-        <w:pStyle w:val="ListParagraph"/>
-        <w:numPr>
-          <w:ilvl w:val="0"/>
-          <w:numId w:val="1"/>
-        </w:numPr>
-        <w:bidi w:val="false"/>
-        <w:spacing w:after="120"/>
-        <w:jc w:val="left"/>
-      </w:pPr>
-      <w:r>
-        <w:rPr>
-          <w:rFonts w:ascii="Calibri" w:cs="Calibri" w:hAnsi="Calibri"/>
-          <w:sz w:val="22"/>
-          <w:szCs w:val="22"/>
-          <w:rtl w:val="false"/>
-        </w:rPr>
-        <w:t xml:space="preserve">The lawyer sends the document for signature from the platform, and the signer receives a signing request in the THEQA app.</w:t>
-      </w:r>
-    </w:p>
-    <w:p>
-      <w:pPr>
-        <w:pStyle w:val="ListParagraph"/>
-        <w:numPr>
-          <w:ilvl w:val="0"/>
-          <w:numId w:val="1"/>
-        </w:numPr>
-        <w:bidi w:val="false"/>
-        <w:spacing w:after="120"/>
-        <w:jc w:val="left"/>
-      </w:pPr>
-      <w:r>
-        <w:rPr>
-          <w:rFonts w:ascii="Calibri" w:cs="Calibri" w:hAnsi="Calibri"/>
-          <w:sz w:val="22"/>
-          <w:szCs w:val="22"/>
-          <w:rtl w:val="false"/>
-        </w:rPr>
-        <w:t xml:space="preserve">Signing requires the signer's identity at the high verification level, as THEQA requires.</w:t>
-      </w:r>
-    </w:p>
-    <w:p>
-      <w:pPr>
-        <w:pStyle w:val="ListParagraph"/>
-        <w:numPr>
-          <w:ilvl w:val="0"/>
-          <w:numId w:val="1"/>
-        </w:numPr>
-        <w:bidi w:val="false"/>
-        <w:spacing w:after="120"/>
-        <w:jc w:val="left"/>
-      </w:pPr>
-      <w:r>
-        <w:rPr>
-          <w:rFonts w:ascii="Calibri" w:cs="Calibri" w:hAnsi="Calibri"/>
-          <w:sz w:val="22"/>
-          <w:szCs w:val="22"/>
-          <w:rtl w:val="false"/>
-        </w:rPr>
-        <w:t xml:space="preserve">The platform keeps the signed document and its verification result in the document's record.</w:t>
-      </w:r>
-    </w:p>
-    <w:p>
-      <w:pPr>
-        <w:pStyle w:val="ListParagraph"/>
-        <w:numPr>
-          <w:ilvl w:val="0"/>
-          <w:numId w:val="1"/>
-        </w:numPr>
-        <w:bidi w:val="false"/>
-        <w:spacing w:after="120"/>
-        <w:jc w:val="left"/>
-      </w:pPr>
-      <w:r>
-        <w:rPr>
-          <w:rFonts w:ascii="Calibri" w:cs="Calibri" w:hAnsi="Calibri"/>
-          <w:sz w:val="22"/>
-          <w:szCs w:val="22"/>
-          <w:rtl w:val="false"/>
-        </w:rPr>
-        <w:t xml:space="preserve">The service will not be used for documents the law requires to be notarized or authenticated by another authority, except as the regulations allow.</w:t>
+        <w:bidi w:val="false"/>
+        <w:spacing w:after="120"/>
+        <w:jc w:val="left"/>
+      </w:pPr>
+      <w:r>
+        <w:rPr>
+          <w:rFonts w:ascii="Calibri" w:cs="Calibri" w:hAnsi="Calibri"/>
+          <w:sz w:val="22"/>
+          <w:szCs w:val="22"/>
+          <w:rtl w:val="false"/>
+        </w:rPr>
+        <w:t xml:space="preserve">•  Example documents: fee agreements and engagement letters, settlement agreements, client acknowledgments and internal minutes.</w:t>
+      </w:r>
+    </w:p>
+    <w:p>
+      <w:pPr>
+        <w:bidi w:val="false"/>
+        <w:spacing w:after="120"/>
+        <w:jc w:val="left"/>
+      </w:pPr>
+      <w:r>
+        <w:rPr>
+          <w:rFonts w:ascii="Calibri" w:cs="Calibri" w:hAnsi="Calibri"/>
+          <w:sz w:val="22"/>
+          <w:szCs w:val="22"/>
+          <w:rtl w:val="false"/>
+        </w:rPr>
+        <w:t xml:space="preserve">•  The lawyer sends the document for signature from the platform, and the signer receives a signing request in the THEQA app.</w:t>
+      </w:r>
+    </w:p>
+    <w:p>
+      <w:pPr>
+        <w:bidi w:val="false"/>
+        <w:spacing w:after="120"/>
+        <w:jc w:val="left"/>
+      </w:pPr>
+      <w:r>
+        <w:rPr>
+          <w:rFonts w:ascii="Calibri" w:cs="Calibri" w:hAnsi="Calibri"/>
+          <w:sz w:val="22"/>
+          <w:szCs w:val="22"/>
+          <w:rtl w:val="false"/>
+        </w:rPr>
+        <w:t xml:space="preserve">•  Signing requires the signer's identity at the high verification level, as THEQA requires.</w:t>
+      </w:r>
+    </w:p>
+    <w:p>
+      <w:pPr>
+        <w:bidi w:val="false"/>
+        <w:spacing w:after="120"/>
+        <w:jc w:val="left"/>
+      </w:pPr>
+      <w:r>
+        <w:rPr>
+          <w:rFonts w:ascii="Calibri" w:cs="Calibri" w:hAnsi="Calibri"/>
+          <w:sz w:val="22"/>
+          <w:szCs w:val="22"/>
+          <w:rtl w:val="false"/>
+        </w:rPr>
+        <w:t xml:space="preserve">•  The platform keeps the signed document and its verification result in the document's record.</w:t>
+      </w:r>
+    </w:p>
+    <w:p>
+      <w:pPr>
+        <w:bidi w:val="false"/>
+        <w:spacing w:after="120"/>
+        <w:jc w:val="left"/>
+      </w:pPr>
+      <w:r>
+        <w:rPr>
+          <w:rFonts w:ascii="Calibri" w:cs="Calibri" w:hAnsi="Calibri"/>
+          <w:sz w:val="22"/>
+          <w:szCs w:val="22"/>
+          <w:rtl w:val="false"/>
+        </w:rPr>
+        <w:t xml:space="preserve">•  The service will not be used for documents the law requires to be notarized or authenticated by another authority, except as the regulations allow.</w:t>
       </w:r>
     </w:p>
     <w:p>
@@ -3442,23 +3197,18 @@
     </w:p>
     <w:p>
       <w:pPr>
-        <w:pStyle w:val="ListParagraph"/>
-        <w:numPr>
-          <w:ilvl w:val="0"/>
-          <w:numId w:val="1"/>
-        </w:numPr>
-        <w:bidi w:val="false"/>
-        <w:spacing w:after="120"/>
-        <w:jc w:val="left"/>
-      </w:pPr>
-      <w:r>
-        <w:rPr>
-          <w:rFonts w:ascii="Calibri" w:cs="Calibri" w:hAnsi="Calibri"/>
-          <w:sz w:val="22"/>
-          <w:szCs w:val="22"/>
-          <w:rtl w:val="false"/>
-        </w:rPr>
-        <w:t xml:space="preserve">A lawyer uploads a digitally signed document received from another party; the platform checks the signature and certificate status through the verification service and shows the result.</w:t>
+        <w:bidi w:val="false"/>
+        <w:spacing w:after="120"/>
+        <w:jc w:val="left"/>
+      </w:pPr>
+      <w:r>
+        <w:rPr>
+          <w:rFonts w:ascii="Calibri" w:cs="Calibri" w:hAnsi="Calibri"/>
+          <w:sz w:val="22"/>
+          <w:szCs w:val="22"/>
+          <w:rtl w:val="false"/>
+        </w:rPr>
+        <w:t xml:space="preserve">•  A lawyer uploads a digitally signed document received from another party; the platform checks the signature and certificate status through the verification service and shows the result.</w:t>
       </w:r>
     </w:p>
     <w:p>
@@ -3843,128 +3593,98 @@
     </w:p>
     <w:p>
       <w:pPr>
-        <w:pStyle w:val="ListParagraph"/>
-        <w:numPr>
-          <w:ilvl w:val="0"/>
-          <w:numId w:val="1"/>
-        </w:numPr>
-        <w:bidi w:val="false"/>
-        <w:spacing w:after="120"/>
-        <w:jc w:val="left"/>
-      </w:pPr>
-      <w:r>
-        <w:rPr>
-          <w:rFonts w:ascii="Calibri" w:cs="Calibri" w:hAnsi="Calibri"/>
-          <w:sz w:val="22"/>
-          <w:szCs w:val="22"/>
-          <w:rtl w:val="false"/>
-        </w:rPr>
-        <w:t xml:space="preserve">Application type: a web application used in desktop and mobile browsers, running on our servers (Node.js and a PostgreSQL database).</w:t>
-      </w:r>
-    </w:p>
-    <w:p>
-      <w:pPr>
-        <w:pStyle w:val="ListParagraph"/>
-        <w:numPr>
-          <w:ilvl w:val="0"/>
-          <w:numId w:val="1"/>
-        </w:numPr>
-        <w:bidi w:val="false"/>
-        <w:spacing w:after="120"/>
-        <w:jc w:val="left"/>
-      </w:pPr>
-      <w:r>
-        <w:rPr>
-          <w:rFonts w:ascii="Calibri" w:cs="Calibri" w:hAnsi="Calibri"/>
-          <w:sz w:val="22"/>
-          <w:szCs w:val="22"/>
-          <w:rtl w:val="false"/>
-        </w:rPr>
-        <w:t xml:space="preserve">Sign-in: we prefer OpenID Connect or OAuth 2.0, or SAML 2.0, with push notification and QR code support.</w:t>
-      </w:r>
-    </w:p>
-    <w:p>
-      <w:pPr>
-        <w:pStyle w:val="ListParagraph"/>
-        <w:numPr>
-          <w:ilvl w:val="0"/>
-          <w:numId w:val="1"/>
-        </w:numPr>
-        <w:bidi w:val="false"/>
-        <w:spacing w:after="120"/>
-        <w:jc w:val="left"/>
-      </w:pPr>
-      <w:r>
-        <w:rPr>
-          <w:rFonts w:ascii="Calibri" w:cs="Calibri" w:hAnsi="Calibri"/>
-          <w:sz w:val="22"/>
-          <w:szCs w:val="22"/>
-          <w:rtl w:val="false"/>
-        </w:rPr>
-        <w:t xml:space="preserve">Signing: an API to submit a signing request and receive the result through a callback; we prefer a PAdES signed PDF with a time stamp.</w:t>
-      </w:r>
-    </w:p>
-    <w:p>
-      <w:pPr>
-        <w:pStyle w:val="ListParagraph"/>
-        <w:numPr>
-          <w:ilvl w:val="0"/>
-          <w:numId w:val="1"/>
-        </w:numPr>
-        <w:bidi w:val="false"/>
-        <w:spacing w:after="120"/>
-        <w:jc w:val="left"/>
-      </w:pPr>
-      <w:r>
-        <w:rPr>
-          <w:rFonts w:ascii="Calibri" w:cs="Calibri" w:hAnsi="Calibri"/>
-          <w:sz w:val="22"/>
-          <w:szCs w:val="22"/>
-          <w:rtl w:val="false"/>
-        </w:rPr>
-        <w:t xml:space="preserve">Verification: an API to verify a signature and certificate status (OCSP).</w:t>
-      </w:r>
-    </w:p>
-    <w:p>
-      <w:pPr>
-        <w:pStyle w:val="ListParagraph"/>
-        <w:numPr>
-          <w:ilvl w:val="0"/>
-          <w:numId w:val="1"/>
-        </w:numPr>
-        <w:bidi w:val="false"/>
-        <w:spacing w:after="120"/>
-        <w:jc w:val="left"/>
-      </w:pPr>
-      <w:r>
-        <w:rPr>
-          <w:rFonts w:ascii="Calibri" w:cs="Calibri" w:hAnsi="Calibri"/>
-          <w:sz w:val="22"/>
-          <w:szCs w:val="22"/>
-          <w:rtl w:val="false"/>
-        </w:rPr>
-        <w:t xml:space="preserve">A sandbox and test accounts before moving to production.</w:t>
-      </w:r>
-    </w:p>
-    <w:p>
-      <w:pPr>
-        <w:pStyle w:val="ListParagraph"/>
-        <w:numPr>
-          <w:ilvl w:val="0"/>
-          <w:numId w:val="1"/>
-        </w:numPr>
-        <w:bidi w:val="false"/>
-        <w:spacing w:after="120"/>
-        <w:jc w:val="left"/>
-      </w:pPr>
-      <w:r>
-        <w:rPr>
-          <w:rFonts w:ascii="Calibri" w:cs="Calibri" w:hAnsi="Calibri"/>
-          <w:sz w:val="22"/>
-          <w:szCs w:val="22"/>
-          <w:rtl w:val="false"/>
-        </w:rPr>
-        <w:t xml:space="preserve">We will meet any integration requirements the Ministry sets, such as server certificates, IP allowlisting or mutual TLS.</w:t>
+        <w:bidi w:val="false"/>
+        <w:spacing w:after="120"/>
+        <w:jc w:val="left"/>
+      </w:pPr>
+      <w:r>
+        <w:rPr>
+          <w:rFonts w:ascii="Calibri" w:cs="Calibri" w:hAnsi="Calibri"/>
+          <w:sz w:val="22"/>
+          <w:szCs w:val="22"/>
+          <w:rtl w:val="false"/>
+        </w:rPr>
+        <w:t xml:space="preserve">•  Application type: a web application used in desktop and mobile browsers, running on our servers (Node.js and a PostgreSQL database).</w:t>
+      </w:r>
+    </w:p>
+    <w:p>
+      <w:pPr>
+        <w:bidi w:val="false"/>
+        <w:spacing w:after="120"/>
+        <w:jc w:val="left"/>
+      </w:pPr>
+      <w:r>
+        <w:rPr>
+          <w:rFonts w:ascii="Calibri" w:cs="Calibri" w:hAnsi="Calibri"/>
+          <w:sz w:val="22"/>
+          <w:szCs w:val="22"/>
+          <w:rtl w:val="false"/>
+        </w:rPr>
+        <w:t xml:space="preserve">•  Sign-in: we prefer OpenID Connect or OAuth 2.0, or SAML 2.0, with push notification and QR code support.</w:t>
+      </w:r>
+    </w:p>
+    <w:p>
+      <w:pPr>
+        <w:bidi w:val="false"/>
+        <w:spacing w:after="120"/>
+        <w:jc w:val="left"/>
+      </w:pPr>
+      <w:r>
+        <w:rPr>
+          <w:rFonts w:ascii="Calibri" w:cs="Calibri" w:hAnsi="Calibri"/>
+          <w:sz w:val="22"/>
+          <w:szCs w:val="22"/>
+          <w:rtl w:val="false"/>
+        </w:rPr>
+        <w:t xml:space="preserve">•  Signing: an API to submit a signing request and receive the result through a callback; we prefer a PAdES signed PDF with a time stamp.</w:t>
+      </w:r>
+    </w:p>
+    <w:p>
+      <w:pPr>
+        <w:bidi w:val="false"/>
+        <w:spacing w:after="120"/>
+        <w:jc w:val="left"/>
+      </w:pPr>
+      <w:r>
+        <w:rPr>
+          <w:rFonts w:ascii="Calibri" w:cs="Calibri" w:hAnsi="Calibri"/>
+          <w:sz w:val="22"/>
+          <w:szCs w:val="22"/>
+          <w:rtl w:val="false"/>
+        </w:rPr>
+        <w:t xml:space="preserve">•  Verification: an API to verify a signature and certificate status (OCSP).</w:t>
+      </w:r>
+    </w:p>
+    <w:p>
+      <w:pPr>
+        <w:bidi w:val="false"/>
+        <w:spacing w:after="120"/>
+        <w:jc w:val="left"/>
+      </w:pPr>
+      <w:r>
+        <w:rPr>
+          <w:rFonts w:ascii="Calibri" w:cs="Calibri" w:hAnsi="Calibri"/>
+          <w:sz w:val="22"/>
+          <w:szCs w:val="22"/>
+          <w:rtl w:val="false"/>
+        </w:rPr>
+        <w:t xml:space="preserve">•  A sandbox and test accounts before moving to production.</w:t>
+      </w:r>
+    </w:p>
+    <w:p>
+      <w:pPr>
+        <w:bidi w:val="false"/>
+        <w:spacing w:after="120"/>
+        <w:jc w:val="left"/>
+      </w:pPr>
+      <w:r>
+        <w:rPr>
+          <w:rFonts w:ascii="Calibri" w:cs="Calibri" w:hAnsi="Calibri"/>
+          <w:sz w:val="22"/>
+          <w:szCs w:val="22"/>
+          <w:rtl w:val="false"/>
+        </w:rPr>
+        <w:t xml:space="preserve">•  We will meet any integration requirements the Ministry sets, such as server certificates, IP allowlisting or mutual TLS.</w:t>
       </w:r>
     </w:p>
     <w:p>
@@ -3987,128 +3707,98 @@
     </w:p>
     <w:p>
       <w:pPr>
-        <w:pStyle w:val="ListParagraph"/>
-        <w:numPr>
-          <w:ilvl w:val="0"/>
-          <w:numId w:val="1"/>
-        </w:numPr>
-        <w:bidi w:val="false"/>
-        <w:spacing w:after="120"/>
-        <w:jc w:val="left"/>
-      </w:pPr>
-      <w:r>
-        <w:rPr>
-          <w:rFonts w:ascii="Calibri" w:cs="Calibri" w:hAnsi="Calibri"/>
-          <w:sz w:val="22"/>
-          <w:szCs w:val="22"/>
-          <w:rtl w:val="false"/>
-        </w:rPr>
-        <w:t xml:space="preserve">We comply with the Personal Data Protection Law (Royal Decree 6/2022) and its executive regulation, and the Electronic Transactions Law (Royal Decree 39/2025).</w:t>
-      </w:r>
-    </w:p>
-    <w:p>
-      <w:pPr>
-        <w:pStyle w:val="ListParagraph"/>
-        <w:numPr>
-          <w:ilvl w:val="0"/>
-          <w:numId w:val="1"/>
-        </w:numPr>
-        <w:bidi w:val="false"/>
-        <w:spacing w:after="120"/>
-        <w:jc w:val="left"/>
-      </w:pPr>
-      <w:r>
-        <w:rPr>
-          <w:rFonts w:ascii="Calibri" w:cs="Calibri" w:hAnsi="Calibri"/>
-          <w:sz w:val="22"/>
-          <w:szCs w:val="22"/>
-          <w:rtl w:val="false"/>
-        </w:rPr>
-        <w:t xml:space="preserve">Users give explicit consent before any THEQA data is shared, and data is used only for the stated purpose.</w:t>
-      </w:r>
-    </w:p>
-    <w:p>
-      <w:pPr>
-        <w:pStyle w:val="ListParagraph"/>
-        <w:numPr>
-          <w:ilvl w:val="0"/>
-          <w:numId w:val="1"/>
-        </w:numPr>
-        <w:bidi w:val="false"/>
-        <w:spacing w:after="120"/>
-        <w:jc w:val="left"/>
-      </w:pPr>
-      <w:r>
-        <w:rPr>
-          <w:rFonts w:ascii="Calibri" w:cs="Calibri" w:hAnsi="Calibri"/>
-          <w:sz w:val="22"/>
-          <w:szCs w:val="22"/>
-          <w:rtl w:val="false"/>
-        </w:rPr>
-        <w:t xml:space="preserve">All connections are encrypted with TLS; integration keys and secrets are stored encrypted (AES-256-GCM).</w:t>
-      </w:r>
-    </w:p>
-    <w:p>
-      <w:pPr>
-        <w:pStyle w:val="ListParagraph"/>
-        <w:numPr>
-          <w:ilvl w:val="0"/>
-          <w:numId w:val="1"/>
-        </w:numPr>
-        <w:bidi w:val="false"/>
-        <w:spacing w:after="120"/>
-        <w:jc w:val="left"/>
-      </w:pPr>
-      <w:r>
-        <w:rPr>
-          <w:rFonts w:ascii="Calibri" w:cs="Calibri" w:hAnsi="Calibri"/>
-          <w:sz w:val="22"/>
-          <w:szCs w:val="22"/>
-          <w:rtl w:val="false"/>
-        </w:rPr>
-        <w:t xml:space="preserve">Role-based access, an audit log of sign-ins, changes and downloads, and two-step verification for users.</w:t>
-      </w:r>
-    </w:p>
-    <w:p>
-      <w:pPr>
-        <w:pStyle w:val="ListParagraph"/>
-        <w:numPr>
-          <w:ilvl w:val="0"/>
-          <w:numId w:val="1"/>
-        </w:numPr>
-        <w:bidi w:val="false"/>
-        <w:spacing w:after="120"/>
-        <w:jc w:val="left"/>
-      </w:pPr>
-      <w:r>
-        <w:rPr>
-          <w:rFonts w:ascii="Calibri" w:cs="Calibri" w:hAnsi="Calibri"/>
-          <w:sz w:val="22"/>
-          <w:szCs w:val="22"/>
-          <w:rtl w:val="false"/>
-        </w:rPr>
-        <w:t xml:space="preserve">Hosting: the platform is currently hosted with a cloud provider outside Oman, and we plan to move Omani customers' data to a hosting provider inside the Sultanate. Please tell us whether hosting in Oman is a condition for THEQA integration.</w:t>
-      </w:r>
-    </w:p>
-    <w:p>
-      <w:pPr>
-        <w:pStyle w:val="ListParagraph"/>
-        <w:numPr>
-          <w:ilvl w:val="0"/>
-          <w:numId w:val="1"/>
-        </w:numPr>
-        <w:bidi w:val="false"/>
-        <w:spacing w:after="120"/>
-        <w:jc w:val="left"/>
-      </w:pPr>
-      <w:r>
-        <w:rPr>
-          <w:rFonts w:ascii="Calibri" w:cs="Calibri" w:hAnsi="Calibri"/>
-          <w:sz w:val="22"/>
-          <w:szCs w:val="22"/>
-          <w:rtl w:val="false"/>
-        </w:rPr>
-        <w:t xml:space="preserve">We are ready to complete any security assessment or penetration test the Ministry requires before production.</w:t>
+        <w:bidi w:val="false"/>
+        <w:spacing w:after="120"/>
+        <w:jc w:val="left"/>
+      </w:pPr>
+      <w:r>
+        <w:rPr>
+          <w:rFonts w:ascii="Calibri" w:cs="Calibri" w:hAnsi="Calibri"/>
+          <w:sz w:val="22"/>
+          <w:szCs w:val="22"/>
+          <w:rtl w:val="false"/>
+        </w:rPr>
+        <w:t xml:space="preserve">•  We comply with the Personal Data Protection Law (Royal Decree 6/2022) and its executive regulation, and the Electronic Transactions Law (Royal Decree 39/2025).</w:t>
+      </w:r>
+    </w:p>
+    <w:p>
+      <w:pPr>
+        <w:bidi w:val="false"/>
+        <w:spacing w:after="120"/>
+        <w:jc w:val="left"/>
+      </w:pPr>
+      <w:r>
+        <w:rPr>
+          <w:rFonts w:ascii="Calibri" w:cs="Calibri" w:hAnsi="Calibri"/>
+          <w:sz w:val="22"/>
+          <w:szCs w:val="22"/>
+          <w:rtl w:val="false"/>
+        </w:rPr>
+        <w:t xml:space="preserve">•  Users give explicit consent before any THEQA data is shared, and data is used only for the stated purpose.</w:t>
+      </w:r>
+    </w:p>
+    <w:p>
+      <w:pPr>
+        <w:bidi w:val="false"/>
+        <w:spacing w:after="120"/>
+        <w:jc w:val="left"/>
+      </w:pPr>
+      <w:r>
+        <w:rPr>
+          <w:rFonts w:ascii="Calibri" w:cs="Calibri" w:hAnsi="Calibri"/>
+          <w:sz w:val="22"/>
+          <w:szCs w:val="22"/>
+          <w:rtl w:val="false"/>
+        </w:rPr>
+        <w:t xml:space="preserve">•  All connections are encrypted with TLS; integration keys and secrets are stored encrypted (AES-256-GCM).</w:t>
+      </w:r>
+    </w:p>
+    <w:p>
+      <w:pPr>
+        <w:bidi w:val="false"/>
+        <w:spacing w:after="120"/>
+        <w:jc w:val="left"/>
+      </w:pPr>
+      <w:r>
+        <w:rPr>
+          <w:rFonts w:ascii="Calibri" w:cs="Calibri" w:hAnsi="Calibri"/>
+          <w:sz w:val="22"/>
+          <w:szCs w:val="22"/>
+          <w:rtl w:val="false"/>
+        </w:rPr>
+        <w:t xml:space="preserve">•  Role-based access, an audit log of sign-ins, changes and downloads, and two-step verification for users.</w:t>
+      </w:r>
+    </w:p>
+    <w:p>
+      <w:pPr>
+        <w:bidi w:val="false"/>
+        <w:spacing w:after="120"/>
+        <w:jc w:val="left"/>
+      </w:pPr>
+      <w:r>
+        <w:rPr>
+          <w:rFonts w:ascii="Calibri" w:cs="Calibri" w:hAnsi="Calibri"/>
+          <w:sz w:val="22"/>
+          <w:szCs w:val="22"/>
+          <w:rtl w:val="false"/>
+        </w:rPr>
+        <w:t xml:space="preserve">•  Hosting: the platform is currently hosted with a cloud provider outside Oman, and we plan to move Omani customers' data to a hosting provider inside the Sultanate. Please tell us whether hosting in Oman is a condition for THEQA integration.</w:t>
+      </w:r>
+    </w:p>
+    <w:p>
+      <w:pPr>
+        <w:bidi w:val="false"/>
+        <w:spacing w:after="120"/>
+        <w:jc w:val="left"/>
+      </w:pPr>
+      <w:r>
+        <w:rPr>
+          <w:rFonts w:ascii="Calibri" w:cs="Calibri" w:hAnsi="Calibri"/>
+          <w:sz w:val="22"/>
+          <w:szCs w:val="22"/>
+          <w:rtl w:val="false"/>
+        </w:rPr>
+        <w:t xml:space="preserve">•  We are ready to complete any security assessment or penetration test the Ministry requires before production.</w:t>
       </w:r>
     </w:p>
     <w:p>
@@ -4593,86 +4283,66 @@
     </w:p>
     <w:p>
       <w:pPr>
-        <w:pStyle w:val="ListParagraph"/>
-        <w:numPr>
-          <w:ilvl w:val="0"/>
-          <w:numId w:val="1"/>
-        </w:numPr>
-        <w:bidi w:val="false"/>
-        <w:spacing w:after="120"/>
-        <w:jc w:val="left"/>
-      </w:pPr>
-      <w:r>
-        <w:rPr>
-          <w:rFonts w:ascii="Calibri" w:cs="Calibri" w:hAnsi="Calibri"/>
-          <w:sz w:val="22"/>
-          <w:szCs w:val="22"/>
-          <w:rtl w:val="false"/>
-        </w:rPr>
-        <w:t xml:space="preserve">Technical integration documents for sign-in, signature and verification.</w:t>
-      </w:r>
-    </w:p>
-    <w:p>
-      <w:pPr>
-        <w:pStyle w:val="ListParagraph"/>
-        <w:numPr>
-          <w:ilvl w:val="0"/>
-          <w:numId w:val="1"/>
-        </w:numPr>
-        <w:bidi w:val="false"/>
-        <w:spacing w:after="120"/>
-        <w:jc w:val="left"/>
-      </w:pPr>
-      <w:r>
-        <w:rPr>
-          <w:rFonts w:ascii="Calibri" w:cs="Calibri" w:hAnsi="Calibri"/>
-          <w:sz w:val="22"/>
-          <w:szCs w:val="22"/>
-          <w:rtl w:val="false"/>
-        </w:rPr>
-        <w:t xml:space="preserve">Access to the test environment, test accounts and integration keys.</w:t>
-      </w:r>
-    </w:p>
-    <w:p>
-      <w:pPr>
-        <w:pStyle w:val="ListParagraph"/>
-        <w:numPr>
-          <w:ilvl w:val="0"/>
-          <w:numId w:val="1"/>
-        </w:numPr>
-        <w:bidi w:val="false"/>
-        <w:spacing w:after="120"/>
-        <w:jc w:val="left"/>
-      </w:pPr>
-      <w:r>
-        <w:rPr>
-          <w:rFonts w:ascii="Calibri" w:cs="Calibri" w:hAnsi="Calibri"/>
-          <w:sz w:val="22"/>
-          <w:szCs w:val="22"/>
-          <w:rtl w:val="false"/>
-        </w:rPr>
-        <w:t xml:space="preserve">The agreement template and any fees, and the security and regulatory requirements for private entities.</w:t>
-      </w:r>
-    </w:p>
-    <w:p>
-      <w:pPr>
-        <w:pStyle w:val="ListParagraph"/>
-        <w:numPr>
-          <w:ilvl w:val="0"/>
-          <w:numId w:val="1"/>
-        </w:numPr>
-        <w:bidi w:val="false"/>
-        <w:spacing w:after="120"/>
-        <w:jc w:val="left"/>
-      </w:pPr>
-      <w:r>
-        <w:rPr>
-          <w:rFonts w:ascii="Calibri" w:cs="Calibri" w:hAnsi="Calibri"/>
-          <w:sz w:val="22"/>
-          <w:szCs w:val="22"/>
-          <w:rtl w:val="false"/>
-        </w:rPr>
-        <w:t xml:space="preserve">Guidance on whether hosting in Oman is required.</w:t>
+        <w:bidi w:val="false"/>
+        <w:spacing w:after="120"/>
+        <w:jc w:val="left"/>
+      </w:pPr>
+      <w:r>
+        <w:rPr>
+          <w:rFonts w:ascii="Calibri" w:cs="Calibri" w:hAnsi="Calibri"/>
+          <w:sz w:val="22"/>
+          <w:szCs w:val="22"/>
+          <w:rtl w:val="false"/>
+        </w:rPr>
+        <w:t xml:space="preserve">•  Technical integration documents for sign-in, signature and verification.</w:t>
+      </w:r>
+    </w:p>
+    <w:p>
+      <w:pPr>
+        <w:bidi w:val="false"/>
+        <w:spacing w:after="120"/>
+        <w:jc w:val="left"/>
+      </w:pPr>
+      <w:r>
+        <w:rPr>
+          <w:rFonts w:ascii="Calibri" w:cs="Calibri" w:hAnsi="Calibri"/>
+          <w:sz w:val="22"/>
+          <w:szCs w:val="22"/>
+          <w:rtl w:val="false"/>
+        </w:rPr>
+        <w:t xml:space="preserve">•  Access to the test environment, test accounts and integration keys.</w:t>
+      </w:r>
+    </w:p>
+    <w:p>
+      <w:pPr>
+        <w:bidi w:val="false"/>
+        <w:spacing w:after="120"/>
+        <w:jc w:val="left"/>
+      </w:pPr>
+      <w:r>
+        <w:rPr>
+          <w:rFonts w:ascii="Calibri" w:cs="Calibri" w:hAnsi="Calibri"/>
+          <w:sz w:val="22"/>
+          <w:szCs w:val="22"/>
+          <w:rtl w:val="false"/>
+        </w:rPr>
+        <w:t xml:space="preserve">•  The agreement template and any fees, and the security and regulatory requirements for private entities.</w:t>
+      </w:r>
+    </w:p>
+    <w:p>
+      <w:pPr>
+        <w:bidi w:val="false"/>
+        <w:spacing w:after="120"/>
+        <w:jc w:val="left"/>
+      </w:pPr>
+      <w:r>
+        <w:rPr>
+          <w:rFonts w:ascii="Calibri" w:cs="Calibri" w:hAnsi="Calibri"/>
+          <w:sz w:val="22"/>
+          <w:szCs w:val="22"/>
+          <w:rtl w:val="false"/>
+        </w:rPr>
+        <w:t xml:space="preserve">•  Guidance on whether hosting in Oman is required.</w:t>
       </w:r>
     </w:p>
     <w:p>

</xml_diff>

<commit_message>
Fill in initial volume and timeline estimates in the THEQA request
Co-Authored-By: Claude Opus 5.5 <noreply@anthropic.com>
Claude-Session: https://claude.ai/code/session_01Xd8FKAdLR1i6PkQ3Huivzz
</commit_message>
<xml_diff>
--- a/docs/integrations/theqa-business-use-case.docx
+++ b/docs/integrations/theqa-business-use-case.docx
@@ -1612,6 +1612,22 @@
         <w:t xml:space="preserve">‏8. الحجم المتوقع والجدول الزمني‏</w:t>
       </w:r>
     </w:p>
+    <w:p>
+      <w:pPr>
+        <w:bidi/>
+        <w:spacing w:after="120"/>
+        <w:jc w:val="right"/>
+      </w:pPr>
+      <w:r>
+        <w:rPr>
+          <w:rFonts w:ascii="Calibri" w:cs="Calibri" w:hAnsi="Calibri"/>
+          <w:sz w:val="22"/>
+          <w:szCs w:val="22"/>
+          <w:rtl/>
+        </w:rPr>
+        <w:t xml:space="preserve">‏المنصة في مرحلة الإطلاق الأولى، والأرقام التالية تقديرات أولية سنحدّثها بعد المرحلة التجريبية:‏</w:t>
+      </w:r>
+    </w:p>
     <w:tbl>
       <w:tblPr>
         <w:bidiVisual/>
@@ -1686,7 +1702,7 @@
                 <w:szCs w:val="21"/>
                 <w:rtl/>
               </w:rPr>
-              <w:t xml:space="preserve">‏التقدير‏</w:t>
+              <w:t xml:space="preserve">‏التقدير الأولي‏</w:t>
             </w:r>
           </w:p>
         </w:tc>
@@ -1716,7 +1732,7 @@
                 <w:szCs w:val="21"/>
                 <w:rtl/>
               </w:rPr>
-              <w:t xml:space="preserve">‏عدد المكاتب في المرحلة الأولى‏</w:t>
+              <w:t xml:space="preserve">‏عدد المكاتب في المرحلة التجريبية‏</w:t>
             </w:r>
           </w:p>
         </w:tc>
@@ -1744,7 +1760,7 @@
                 <w:szCs w:val="21"/>
                 <w:rtl/>
               </w:rPr>
-              <w:t xml:space="preserve">‏[عدد]‏</w:t>
+              <w:t xml:space="preserve">‏من 5 إلى 10 مكاتب محاماة في سلطنة عُمان‏</w:t>
             </w:r>
           </w:p>
         </w:tc>
@@ -1774,7 +1790,7 @@
                 <w:szCs w:val="21"/>
                 <w:rtl/>
               </w:rPr>
-              <w:t xml:space="preserve">‏عدد المستخدمين المتوقع خلال السنة الأولى‏</w:t>
+              <w:t xml:space="preserve">‏عدد المستخدمين خلال السنة الأولى‏</w:t>
             </w:r>
           </w:p>
         </w:tc>
@@ -1802,7 +1818,7 @@
                 <w:szCs w:val="21"/>
                 <w:rtl/>
               </w:rPr>
-              <w:t xml:space="preserve">‏[عدد]‏</w:t>
+              <w:t xml:space="preserve">‏حتى 200 مستخدم (محامون وموظفون وموكلون)‏</w:t>
             </w:r>
           </w:p>
         </w:tc>
@@ -1832,7 +1848,7 @@
                 <w:szCs w:val="21"/>
                 <w:rtl/>
               </w:rPr>
-              <w:t xml:space="preserve">‏عمليات الدخول شهرياً‏</w:t>
+              <w:t xml:space="preserve">‏عمليات الدخول عبر ثقة شهرياً‏</w:t>
             </w:r>
           </w:p>
         </w:tc>
@@ -1860,7 +1876,7 @@
                 <w:szCs w:val="21"/>
                 <w:rtl/>
               </w:rPr>
-              <w:t xml:space="preserve">‏[عدد]‏</w:t>
+              <w:t xml:space="preserve">‏حتى 3,000 عملية‏</w:t>
             </w:r>
           </w:p>
         </w:tc>
@@ -1890,7 +1906,7 @@
                 <w:szCs w:val="21"/>
                 <w:rtl/>
               </w:rPr>
-              <w:t xml:space="preserve">‏عمليات التوقيع شهرياً‏</w:t>
+              <w:t xml:space="preserve">‏التحقق من هوية الموكلين شهرياً‏</w:t>
             </w:r>
           </w:p>
         </w:tc>
@@ -1918,7 +1934,7 @@
                 <w:szCs w:val="21"/>
                 <w:rtl/>
               </w:rPr>
-              <w:t xml:space="preserve">‏[عدد]‏</w:t>
+              <w:t xml:space="preserve">‏حتى 200 عملية‏</w:t>
             </w:r>
           </w:p>
         </w:tc>
@@ -1948,7 +1964,7 @@
                 <w:szCs w:val="21"/>
                 <w:rtl/>
               </w:rPr>
-              <w:t xml:space="preserve">‏الربط في بيئة الاختبار‏</w:t>
+              <w:t xml:space="preserve">‏عمليات التوقيع شهرياً‏</w:t>
             </w:r>
           </w:p>
         </w:tc>
@@ -1976,7 +1992,7 @@
                 <w:szCs w:val="21"/>
                 <w:rtl/>
               </w:rPr>
-              <w:t xml:space="preserve">‏خلال [عدد] أسابيع من استلام الوثائق‏</w:t>
+              <w:t xml:space="preserve">‏حتى 300 عملية‏</w:t>
             </w:r>
           </w:p>
         </w:tc>
@@ -2006,6 +2022,64 @@
                 <w:szCs w:val="21"/>
                 <w:rtl/>
               </w:rPr>
+              <w:t xml:space="preserve">‏الربط في بيئة الاختبار‏</w:t>
+            </w:r>
+          </w:p>
+        </w:tc>
+        <w:tc>
+          <w:tcPr>
+            <w:tcW w:type="pct" w:w="3100"/>
+            <w:tcBorders>
+              <w:top w:val="single" w:color="BFBFBF" w:sz="4"/>
+              <w:left w:val="single" w:color="BFBFBF" w:sz="4"/>
+              <w:bottom w:val="single" w:color="BFBFBF" w:sz="4"/>
+              <w:right w:val="single" w:color="BFBFBF" w:sz="4"/>
+            </w:tcBorders>
+          </w:tcPr>
+          <w:p>
+            <w:pPr>
+              <w:bidi/>
+              <w:spacing w:after="120"/>
+              <w:jc w:val="right"/>
+            </w:pPr>
+            <w:r>
+              <w:rPr>
+                <w:rFonts w:ascii="Calibri" w:cs="Calibri" w:hAnsi="Calibri"/>
+                <w:b w:val="false"/>
+                <w:sz w:val="21"/>
+                <w:szCs w:val="21"/>
+                <w:rtl/>
+              </w:rPr>
+              <w:t xml:space="preserve">‏خلال 4 أسابيع من استلام الوثائق الفنية‏</w:t>
+            </w:r>
+          </w:p>
+        </w:tc>
+      </w:tr>
+      <w:tr>
+        <w:tc>
+          <w:tcPr>
+            <w:tcW w:type="pct" w:w="1900"/>
+            <w:tcBorders>
+              <w:top w:val="single" w:color="BFBFBF" w:sz="4"/>
+              <w:left w:val="single" w:color="BFBFBF" w:sz="4"/>
+              <w:bottom w:val="single" w:color="BFBFBF" w:sz="4"/>
+              <w:right w:val="single" w:color="BFBFBF" w:sz="4"/>
+            </w:tcBorders>
+          </w:tcPr>
+          <w:p>
+            <w:pPr>
+              <w:bidi/>
+              <w:spacing w:after="120"/>
+              <w:jc w:val="right"/>
+            </w:pPr>
+            <w:r>
+              <w:rPr>
+                <w:rFonts w:ascii="Calibri" w:cs="Calibri" w:hAnsi="Calibri"/>
+                <w:b w:val="false"/>
+                <w:sz w:val="21"/>
+                <w:szCs w:val="21"/>
+                <w:rtl/>
+              </w:rPr>
               <w:t xml:space="preserve">‏الإطلاق التجريبي مع مكاتب مختارة‏</w:t>
             </w:r>
           </w:p>
@@ -2034,7 +2108,7 @@
                 <w:szCs w:val="21"/>
                 <w:rtl/>
               </w:rPr>
-              <w:t xml:space="preserve">‏[الشهر والسنة]‏</w:t>
+              <w:t xml:space="preserve">‏خلال شهرين من اعتماد الربط في بيئة الاختبار‏</w:t>
             </w:r>
           </w:p>
         </w:tc>
@@ -3819,6 +3893,22 @@
         <w:t xml:space="preserve">8. Expected volume and timeline</w:t>
       </w:r>
     </w:p>
+    <w:p>
+      <w:pPr>
+        <w:bidi w:val="false"/>
+        <w:spacing w:after="120"/>
+        <w:jc w:val="left"/>
+      </w:pPr>
+      <w:r>
+        <w:rPr>
+          <w:rFonts w:ascii="Calibri" w:cs="Calibri" w:hAnsi="Calibri"/>
+          <w:sz w:val="22"/>
+          <w:szCs w:val="22"/>
+          <w:rtl w:val="false"/>
+        </w:rPr>
+        <w:t xml:space="preserve">The platform is at an early launch stage. These are initial estimates, which we will update after the pilot:</w:t>
+      </w:r>
+    </w:p>
     <w:tbl>
       <w:tblPr>
         <w:bidiVisual w:val="off"/>
@@ -3893,7 +3983,7 @@
                 <w:szCs w:val="21"/>
                 <w:rtl w:val="false"/>
               </w:rPr>
-              <w:t xml:space="preserve">Estimate</w:t>
+              <w:t xml:space="preserve">Initial estimate</w:t>
             </w:r>
           </w:p>
         </w:tc>
@@ -3923,7 +4013,7 @@
                 <w:szCs w:val="21"/>
                 <w:rtl w:val="false"/>
               </w:rPr>
-              <w:t xml:space="preserve">Law firms in the first phase</w:t>
+              <w:t xml:space="preserve">Law firms in the pilot</w:t>
             </w:r>
           </w:p>
         </w:tc>
@@ -3951,7 +4041,7 @@
                 <w:szCs w:val="21"/>
                 <w:rtl w:val="false"/>
               </w:rPr>
-              <w:t xml:space="preserve">[number]</w:t>
+              <w:t xml:space="preserve">5 to 10 law firms in Oman</w:t>
             </w:r>
           </w:p>
         </w:tc>
@@ -3981,7 +4071,7 @@
                 <w:szCs w:val="21"/>
                 <w:rtl w:val="false"/>
               </w:rPr>
-              <w:t xml:space="preserve">Expected users in the first year</w:t>
+              <w:t xml:space="preserve">Users in the first year</w:t>
             </w:r>
           </w:p>
         </w:tc>
@@ -4009,7 +4099,7 @@
                 <w:szCs w:val="21"/>
                 <w:rtl w:val="false"/>
               </w:rPr>
-              <w:t xml:space="preserve">[number]</w:t>
+              <w:t xml:space="preserve">Up to 200 (lawyers, staff and clients)</w:t>
             </w:r>
           </w:p>
         </w:tc>
@@ -4039,7 +4129,7 @@
                 <w:szCs w:val="21"/>
                 <w:rtl w:val="false"/>
               </w:rPr>
-              <w:t xml:space="preserve">Sign-ins per month</w:t>
+              <w:t xml:space="preserve">THEQA sign-ins per month</w:t>
             </w:r>
           </w:p>
         </w:tc>
@@ -4067,7 +4157,7 @@
                 <w:szCs w:val="21"/>
                 <w:rtl w:val="false"/>
               </w:rPr>
-              <w:t xml:space="preserve">[number]</w:t>
+              <w:t xml:space="preserve">Up to 3,000</w:t>
             </w:r>
           </w:p>
         </w:tc>
@@ -4097,7 +4187,7 @@
                 <w:szCs w:val="21"/>
                 <w:rtl w:val="false"/>
               </w:rPr>
-              <w:t xml:space="preserve">Signatures per month</w:t>
+              <w:t xml:space="preserve">Client identity checks per month</w:t>
             </w:r>
           </w:p>
         </w:tc>
@@ -4125,7 +4215,7 @@
                 <w:szCs w:val="21"/>
                 <w:rtl w:val="false"/>
               </w:rPr>
-              <w:t xml:space="preserve">[number]</w:t>
+              <w:t xml:space="preserve">Up to 200</w:t>
             </w:r>
           </w:p>
         </w:tc>
@@ -4155,7 +4245,7 @@
                 <w:szCs w:val="21"/>
                 <w:rtl w:val="false"/>
               </w:rPr>
-              <w:t xml:space="preserve">Integration in the test environment</w:t>
+              <w:t xml:space="preserve">Signatures per month</w:t>
             </w:r>
           </w:p>
         </w:tc>
@@ -4183,7 +4273,7 @@
                 <w:szCs w:val="21"/>
                 <w:rtl w:val="false"/>
               </w:rPr>
-              <w:t xml:space="preserve">Within [number] weeks of receiving the documents</w:t>
+              <w:t xml:space="preserve">Up to 300</w:t>
             </w:r>
           </w:p>
         </w:tc>
@@ -4213,6 +4303,64 @@
                 <w:szCs w:val="21"/>
                 <w:rtl w:val="false"/>
               </w:rPr>
+              <w:t xml:space="preserve">Integration in the test environment</w:t>
+            </w:r>
+          </w:p>
+        </w:tc>
+        <w:tc>
+          <w:tcPr>
+            <w:tcW w:type="pct" w:w="3100"/>
+            <w:tcBorders>
+              <w:top w:val="single" w:color="BFBFBF" w:sz="4"/>
+              <w:left w:val="single" w:color="BFBFBF" w:sz="4"/>
+              <w:bottom w:val="single" w:color="BFBFBF" w:sz="4"/>
+              <w:right w:val="single" w:color="BFBFBF" w:sz="4"/>
+            </w:tcBorders>
+          </w:tcPr>
+          <w:p>
+            <w:pPr>
+              <w:bidi w:val="false"/>
+              <w:spacing w:after="120"/>
+              <w:jc w:val="left"/>
+            </w:pPr>
+            <w:r>
+              <w:rPr>
+                <w:rFonts w:ascii="Calibri" w:cs="Calibri" w:hAnsi="Calibri"/>
+                <w:b w:val="false"/>
+                <w:sz w:val="21"/>
+                <w:szCs w:val="21"/>
+                <w:rtl w:val="false"/>
+              </w:rPr>
+              <w:t xml:space="preserve">Within 4 weeks of receiving the technical documents</w:t>
+            </w:r>
+          </w:p>
+        </w:tc>
+      </w:tr>
+      <w:tr>
+        <w:tc>
+          <w:tcPr>
+            <w:tcW w:type="pct" w:w="1900"/>
+            <w:tcBorders>
+              <w:top w:val="single" w:color="BFBFBF" w:sz="4"/>
+              <w:left w:val="single" w:color="BFBFBF" w:sz="4"/>
+              <w:bottom w:val="single" w:color="BFBFBF" w:sz="4"/>
+              <w:right w:val="single" w:color="BFBFBF" w:sz="4"/>
+            </w:tcBorders>
+          </w:tcPr>
+          <w:p>
+            <w:pPr>
+              <w:bidi w:val="false"/>
+              <w:spacing w:after="120"/>
+              <w:jc w:val="left"/>
+            </w:pPr>
+            <w:r>
+              <w:rPr>
+                <w:rFonts w:ascii="Calibri" w:cs="Calibri" w:hAnsi="Calibri"/>
+                <w:b w:val="false"/>
+                <w:sz w:val="21"/>
+                <w:szCs w:val="21"/>
+                <w:rtl w:val="false"/>
+              </w:rPr>
               <w:t xml:space="preserve">Pilot launch with selected firms</w:t>
             </w:r>
           </w:p>
@@ -4241,7 +4389,7 @@
                 <w:szCs w:val="21"/>
                 <w:rtl w:val="false"/>
               </w:rPr>
-              <w:t xml:space="preserve">[month and year]</w:t>
+              <w:t xml:space="preserve">Within 2 months of approval in the test environment</w:t>
             </w:r>
           </w:p>
         </w:tc>

</xml_diff>

<commit_message>
Base THEQA volume and timeline estimates on researched GCC figures
Section 8 now uses Oman's registered lawyers and law firms (Ministry of
Justice and Legal Affairs open data), national authentication volumes
(MTCIT Tahawul), and UAE PASS and Nafath onboarding stages and timings,
with the usage assumptions and sources stated.

Co-Authored-By: Claude Opus 5.5 <noreply@anthropic.com>
Claude-Session: https://claude.ai/code/session_01Xd8FKAdLR1i6PkQ3Huivzz
</commit_message>
<xml_diff>
--- a/docs/integrations/theqa-business-use-case.docx
+++ b/docs/integrations/theqa-business-use-case.docx
@@ -67,7 +67,7 @@
           <w:szCs w:val="20"/>
           <w:rtl/>
         </w:rPr>
-        <w:t xml:space="preserve">‏البريد: Theqa@mtcit.gov.om و pkisupport@mtcit.gov.om‏</w:t>
+        <w:t xml:space="preserve">‏البريد: ⁦Theqa@mtcit.gov.om⁩ و ⁦pkisupport@mtcit.gov.om⁩‏</w:t>
       </w:r>
     </w:p>
     <w:p>
@@ -356,7 +356,7 @@
                 <w:szCs w:val="21"/>
                 <w:rtl/>
               </w:rPr>
-              <w:t xml:space="preserve">‏https://trstiqai.eqence.com‏</w:t>
+              <w:t xml:space="preserve">‏⁦https://trstiqai.eqence.com⁩‏</w:t>
             </w:r>
           </w:p>
         </w:tc>
@@ -1625,7 +1625,23 @@
           <w:szCs w:val="22"/>
           <w:rtl/>
         </w:rPr>
-        <w:t xml:space="preserve">‏المنصة في مرحلة الإطلاق الأولى، والأرقام التالية تقديرات أولية سنحدّثها بعد المرحلة التجريبية:‏</w:t>
+        <w:t xml:space="preserve">‏السوق: بحسب البيانات المفتوحة لوزارة العدل والشؤون القانونية، بلغ عدد المحامين المقيدين 4,275 محامياً وعدد مكاتب المحاماة والشركات المدنية للمحاماة 630 مكتباً (مايو 2022)، أي نحو 7 محامين لكل مكتب في المتوسط. وبلغ عدد طلبات التحقق من الهوية الرقمية في السلطنة 202.9 مليون طلب حتى نهاية 2025.‏</w:t>
+      </w:r>
+    </w:p>
+    <w:p>
+      <w:pPr>
+        <w:bidi/>
+        <w:spacing w:after="120"/>
+        <w:jc w:val="right"/>
+      </w:pPr>
+      <w:r>
+        <w:rPr>
+          <w:rFonts w:ascii="Calibri" w:cs="Calibri" w:hAnsi="Calibri"/>
+          <w:sz w:val="22"/>
+          <w:szCs w:val="22"/>
+          <w:rtl/>
+        </w:rPr>
+        <w:t xml:space="preserve">‏المنصة في مرحلة الإطلاق الأولى، والتقديرات التالية مبنية على هذه الأرقام وعلى الافتراضات المذكورة أدناه، وسنحدّثها بعد المرحلة التجريبية:‏</w:t>
       </w:r>
     </w:p>
     <w:tbl>
@@ -1732,7 +1748,7 @@
                 <w:szCs w:val="21"/>
                 <w:rtl/>
               </w:rPr>
-              <w:t xml:space="preserve">‏عدد المكاتب في المرحلة التجريبية‏</w:t>
+              <w:t xml:space="preserve">‏المكاتب في المرحلة التجريبية‏</w:t>
             </w:r>
           </w:p>
         </w:tc>
@@ -1760,7 +1776,7 @@
                 <w:szCs w:val="21"/>
                 <w:rtl/>
               </w:rPr>
-              <w:t xml:space="preserve">‏من 5 إلى 10 مكاتب محاماة في سلطنة عُمان‏</w:t>
+              <w:t xml:space="preserve">‏10 مكاتب (نحو 1.5% من المكاتب في السلطنة)‏</w:t>
             </w:r>
           </w:p>
         </w:tc>
@@ -1790,7 +1806,7 @@
                 <w:szCs w:val="21"/>
                 <w:rtl/>
               </w:rPr>
-              <w:t xml:space="preserve">‏عدد المستخدمين خلال السنة الأولى‏</w:t>
+              <w:t xml:space="preserve">‏المكاتب بنهاية السنة الأولى‏</w:t>
             </w:r>
           </w:p>
         </w:tc>
@@ -1818,7 +1834,7 @@
                 <w:szCs w:val="21"/>
                 <w:rtl/>
               </w:rPr>
-              <w:t xml:space="preserve">‏حتى 200 مستخدم (محامون وموظفون وموكلون)‏</w:t>
+              <w:t xml:space="preserve">‏حتى 30 مكتباً (نحو 5%)‏</w:t>
             </w:r>
           </w:p>
         </w:tc>
@@ -1848,7 +1864,7 @@
                 <w:szCs w:val="21"/>
                 <w:rtl/>
               </w:rPr>
-              <w:t xml:space="preserve">‏عمليات الدخول عبر ثقة شهرياً‏</w:t>
+              <w:t xml:space="preserve">‏المستخدمون بنهاية السنة الأولى‏</w:t>
             </w:r>
           </w:p>
         </w:tc>
@@ -1876,7 +1892,7 @@
                 <w:szCs w:val="21"/>
                 <w:rtl/>
               </w:rPr>
-              <w:t xml:space="preserve">‏حتى 3,000 عملية‏</w:t>
+              <w:t xml:space="preserve">‏نحو 500 مستخدم: 210 محامين و60 موظفاً و230 موكلاً‏</w:t>
             </w:r>
           </w:p>
         </w:tc>
@@ -1906,7 +1922,7 @@
                 <w:szCs w:val="21"/>
                 <w:rtl/>
               </w:rPr>
-              <w:t xml:space="preserve">‏التحقق من هوية الموكلين شهرياً‏</w:t>
+              <w:t xml:space="preserve">‏عمليات الدخول عبر ثقة شهرياً‏</w:t>
             </w:r>
           </w:p>
         </w:tc>
@@ -1934,7 +1950,7 @@
                 <w:szCs w:val="21"/>
                 <w:rtl/>
               </w:rPr>
-              <w:t xml:space="preserve">‏حتى 200 عملية‏</w:t>
+              <w:t xml:space="preserve">‏نحو 1,800 في المرحلة التجريبية، وحتى 6,000 بنهاية السنة الأولى‏</w:t>
             </w:r>
           </w:p>
         </w:tc>
@@ -1964,7 +1980,7 @@
                 <w:szCs w:val="21"/>
                 <w:rtl/>
               </w:rPr>
-              <w:t xml:space="preserve">‏عمليات التوقيع شهرياً‏</w:t>
+              <w:t xml:space="preserve">‏التحقق من هوية الموكلين شهرياً‏</w:t>
             </w:r>
           </w:p>
         </w:tc>
@@ -1992,7 +2008,7 @@
                 <w:szCs w:val="21"/>
                 <w:rtl/>
               </w:rPr>
-              <w:t xml:space="preserve">‏حتى 300 عملية‏</w:t>
+              <w:t xml:space="preserve">‏من 150 إلى 300 عملية بنهاية السنة الأولى‏</w:t>
             </w:r>
           </w:p>
         </w:tc>
@@ -2022,7 +2038,7 @@
                 <w:szCs w:val="21"/>
                 <w:rtl/>
               </w:rPr>
-              <w:t xml:space="preserve">‏الربط في بيئة الاختبار‏</w:t>
+              <w:t xml:space="preserve">‏عمليات التوقيع شهرياً‏</w:t>
             </w:r>
           </w:p>
         </w:tc>
@@ -2050,7 +2066,7 @@
                 <w:szCs w:val="21"/>
                 <w:rtl/>
               </w:rPr>
-              <w:t xml:space="preserve">‏خلال 4 أسابيع من استلام الوثائق الفنية‏</w:t>
+              <w:t xml:space="preserve">‏نحو 300 عملية بنهاية السنة الأولى‏</w:t>
             </w:r>
           </w:p>
         </w:tc>
@@ -2080,7 +2096,7 @@
                 <w:szCs w:val="21"/>
                 <w:rtl/>
               </w:rPr>
-              <w:t xml:space="preserve">‏الإطلاق التجريبي مع مكاتب مختارة‏</w:t>
+              <w:t xml:space="preserve">‏مراجعة الطلب والموافقة المبدئية‏</w:t>
             </w:r>
           </w:p>
         </w:tc>
@@ -2108,7 +2124,239 @@
                 <w:szCs w:val="21"/>
                 <w:rtl/>
               </w:rPr>
-              <w:t xml:space="preserve">‏خلال شهرين من اعتماد الربط في بيئة الاختبار‏</w:t>
+              <w:t xml:space="preserve">‏من أسبوع إلى 3 أسابيع‏</w:t>
+            </w:r>
+          </w:p>
+        </w:tc>
+      </w:tr>
+      <w:tr>
+        <w:tc>
+          <w:tcPr>
+            <w:tcW w:type="pct" w:w="1900"/>
+            <w:tcBorders>
+              <w:top w:val="single" w:color="BFBFBF" w:sz="4"/>
+              <w:left w:val="single" w:color="BFBFBF" w:sz="4"/>
+              <w:bottom w:val="single" w:color="BFBFBF" w:sz="4"/>
+              <w:right w:val="single" w:color="BFBFBF" w:sz="4"/>
+            </w:tcBorders>
+          </w:tcPr>
+          <w:p>
+            <w:pPr>
+              <w:bidi/>
+              <w:spacing w:after="120"/>
+              <w:jc w:val="right"/>
+            </w:pPr>
+            <w:r>
+              <w:rPr>
+                <w:rFonts w:ascii="Calibri" w:cs="Calibri" w:hAnsi="Calibri"/>
+                <w:b w:val="false"/>
+                <w:sz w:val="21"/>
+                <w:szCs w:val="21"/>
+                <w:rtl/>
+              </w:rPr>
+              <w:t xml:space="preserve">‏الربط والاختبار في بيئة الاختبار‏</w:t>
+            </w:r>
+          </w:p>
+        </w:tc>
+        <w:tc>
+          <w:tcPr>
+            <w:tcW w:type="pct" w:w="3100"/>
+            <w:tcBorders>
+              <w:top w:val="single" w:color="BFBFBF" w:sz="4"/>
+              <w:left w:val="single" w:color="BFBFBF" w:sz="4"/>
+              <w:bottom w:val="single" w:color="BFBFBF" w:sz="4"/>
+              <w:right w:val="single" w:color="BFBFBF" w:sz="4"/>
+            </w:tcBorders>
+          </w:tcPr>
+          <w:p>
+            <w:pPr>
+              <w:bidi/>
+              <w:spacing w:after="120"/>
+              <w:jc w:val="right"/>
+            </w:pPr>
+            <w:r>
+              <w:rPr>
+                <w:rFonts w:ascii="Calibri" w:cs="Calibri" w:hAnsi="Calibri"/>
+                <w:b w:val="false"/>
+                <w:sz w:val="21"/>
+                <w:szCs w:val="21"/>
+                <w:rtl/>
+              </w:rPr>
+              <w:t xml:space="preserve">‏من 4 إلى 6 أسابيع من استلام الوثائق الفنية‏</w:t>
+            </w:r>
+          </w:p>
+        </w:tc>
+      </w:tr>
+      <w:tr>
+        <w:tc>
+          <w:tcPr>
+            <w:tcW w:type="pct" w:w="1900"/>
+            <w:tcBorders>
+              <w:top w:val="single" w:color="BFBFBF" w:sz="4"/>
+              <w:left w:val="single" w:color="BFBFBF" w:sz="4"/>
+              <w:bottom w:val="single" w:color="BFBFBF" w:sz="4"/>
+              <w:right w:val="single" w:color="BFBFBF" w:sz="4"/>
+            </w:tcBorders>
+          </w:tcPr>
+          <w:p>
+            <w:pPr>
+              <w:bidi/>
+              <w:spacing w:after="120"/>
+              <w:jc w:val="right"/>
+            </w:pPr>
+            <w:r>
+              <w:rPr>
+                <w:rFonts w:ascii="Calibri" w:cs="Calibri" w:hAnsi="Calibri"/>
+                <w:b w:val="false"/>
+                <w:sz w:val="21"/>
+                <w:szCs w:val="21"/>
+                <w:rtl/>
+              </w:rPr>
+              <w:t xml:space="preserve">‏التقييم الأمني وإصدار بيانات الإنتاج‏</w:t>
+            </w:r>
+          </w:p>
+        </w:tc>
+        <w:tc>
+          <w:tcPr>
+            <w:tcW w:type="pct" w:w="3100"/>
+            <w:tcBorders>
+              <w:top w:val="single" w:color="BFBFBF" w:sz="4"/>
+              <w:left w:val="single" w:color="BFBFBF" w:sz="4"/>
+              <w:bottom w:val="single" w:color="BFBFBF" w:sz="4"/>
+              <w:right w:val="single" w:color="BFBFBF" w:sz="4"/>
+            </w:tcBorders>
+          </w:tcPr>
+          <w:p>
+            <w:pPr>
+              <w:bidi/>
+              <w:spacing w:after="120"/>
+              <w:jc w:val="right"/>
+            </w:pPr>
+            <w:r>
+              <w:rPr>
+                <w:rFonts w:ascii="Calibri" w:cs="Calibri" w:hAnsi="Calibri"/>
+                <w:b w:val="false"/>
+                <w:sz w:val="21"/>
+                <w:szCs w:val="21"/>
+                <w:rtl/>
+              </w:rPr>
+              <w:t xml:space="preserve">‏من أسبوعين إلى 4 أسابيع‏</w:t>
+            </w:r>
+          </w:p>
+        </w:tc>
+      </w:tr>
+      <w:tr>
+        <w:tc>
+          <w:tcPr>
+            <w:tcW w:type="pct" w:w="1900"/>
+            <w:tcBorders>
+              <w:top w:val="single" w:color="BFBFBF" w:sz="4"/>
+              <w:left w:val="single" w:color="BFBFBF" w:sz="4"/>
+              <w:bottom w:val="single" w:color="BFBFBF" w:sz="4"/>
+              <w:right w:val="single" w:color="BFBFBF" w:sz="4"/>
+            </w:tcBorders>
+          </w:tcPr>
+          <w:p>
+            <w:pPr>
+              <w:bidi/>
+              <w:spacing w:after="120"/>
+              <w:jc w:val="right"/>
+            </w:pPr>
+            <w:r>
+              <w:rPr>
+                <w:rFonts w:ascii="Calibri" w:cs="Calibri" w:hAnsi="Calibri"/>
+                <w:b w:val="false"/>
+                <w:sz w:val="21"/>
+                <w:szCs w:val="21"/>
+                <w:rtl/>
+              </w:rPr>
+              <w:t xml:space="preserve">‏الإطلاق التجريبي‏</w:t>
+            </w:r>
+          </w:p>
+        </w:tc>
+        <w:tc>
+          <w:tcPr>
+            <w:tcW w:type="pct" w:w="3100"/>
+            <w:tcBorders>
+              <w:top w:val="single" w:color="BFBFBF" w:sz="4"/>
+              <w:left w:val="single" w:color="BFBFBF" w:sz="4"/>
+              <w:bottom w:val="single" w:color="BFBFBF" w:sz="4"/>
+              <w:right w:val="single" w:color="BFBFBF" w:sz="4"/>
+            </w:tcBorders>
+          </w:tcPr>
+          <w:p>
+            <w:pPr>
+              <w:bidi/>
+              <w:spacing w:after="120"/>
+              <w:jc w:val="right"/>
+            </w:pPr>
+            <w:r>
+              <w:rPr>
+                <w:rFonts w:ascii="Calibri" w:cs="Calibri" w:hAnsi="Calibri"/>
+                <w:b w:val="false"/>
+                <w:sz w:val="21"/>
+                <w:szCs w:val="21"/>
+                <w:rtl/>
+              </w:rPr>
+              <w:t xml:space="preserve">‏خلال نحو 3 أشهر من استلام الوثائق الفنية‏</w:t>
+            </w:r>
+          </w:p>
+        </w:tc>
+      </w:tr>
+      <w:tr>
+        <w:tc>
+          <w:tcPr>
+            <w:tcW w:type="pct" w:w="1900"/>
+            <w:tcBorders>
+              <w:top w:val="single" w:color="BFBFBF" w:sz="4"/>
+              <w:left w:val="single" w:color="BFBFBF" w:sz="4"/>
+              <w:bottom w:val="single" w:color="BFBFBF" w:sz="4"/>
+              <w:right w:val="single" w:color="BFBFBF" w:sz="4"/>
+            </w:tcBorders>
+          </w:tcPr>
+          <w:p>
+            <w:pPr>
+              <w:bidi/>
+              <w:spacing w:after="120"/>
+              <w:jc w:val="right"/>
+            </w:pPr>
+            <w:r>
+              <w:rPr>
+                <w:rFonts w:ascii="Calibri" w:cs="Calibri" w:hAnsi="Calibri"/>
+                <w:b w:val="false"/>
+                <w:sz w:val="21"/>
+                <w:szCs w:val="21"/>
+                <w:rtl/>
+              </w:rPr>
+              <w:t xml:space="preserve">‏الإطلاق لجميع المكاتب المشتركة‏</w:t>
+            </w:r>
+          </w:p>
+        </w:tc>
+        <w:tc>
+          <w:tcPr>
+            <w:tcW w:type="pct" w:w="3100"/>
+            <w:tcBorders>
+              <w:top w:val="single" w:color="BFBFBF" w:sz="4"/>
+              <w:left w:val="single" w:color="BFBFBF" w:sz="4"/>
+              <w:bottom w:val="single" w:color="BFBFBF" w:sz="4"/>
+              <w:right w:val="single" w:color="BFBFBF" w:sz="4"/>
+            </w:tcBorders>
+          </w:tcPr>
+          <w:p>
+            <w:pPr>
+              <w:bidi/>
+              <w:spacing w:after="120"/>
+              <w:jc w:val="right"/>
+            </w:pPr>
+            <w:r>
+              <w:rPr>
+                <w:rFonts w:ascii="Calibri" w:cs="Calibri" w:hAnsi="Calibri"/>
+                <w:b w:val="false"/>
+                <w:sz w:val="21"/>
+                <w:szCs w:val="21"/>
+                <w:rtl/>
+              </w:rPr>
+              <w:t xml:space="preserve">‏خلال 4 إلى 6 أشهر من استلام الوثائق الفنية‏</w:t>
             </w:r>
           </w:p>
         </w:tc>
@@ -2128,6 +2376,180 @@
           <w:rtl/>
         </w:rPr>
         <w:t xml:space="preserve"/>
+      </w:r>
+    </w:p>
+    <w:p>
+      <w:pPr>
+        <w:bidi/>
+        <w:spacing w:after="120"/>
+        <w:jc w:val="right"/>
+      </w:pPr>
+      <w:r>
+        <w:rPr>
+          <w:rFonts w:ascii="Calibri" w:cs="Calibri" w:hAnsi="Calibri"/>
+          <w:sz w:val="22"/>
+          <w:szCs w:val="22"/>
+          <w:rtl/>
+        </w:rPr>
+        <w:t xml:space="preserve">•  ‏افتراضات الاستخدام: يسجل المحامي أو الموظف الدخول نحو 20 مرة شهرياً (مرة واحدة في كل يوم عمل)، والموكل نحو مرتين شهرياً، ويفتح كل مكتب من 5 إلى 10 ملفات موكلين جدد شهرياً، ويوقّع نحو 10 مستندات شهرياً.‏</w:t>
+      </w:r>
+    </w:p>
+    <w:p>
+      <w:pPr>
+        <w:bidi/>
+        <w:spacing w:after="120"/>
+        <w:jc w:val="right"/>
+      </w:pPr>
+      <w:r>
+        <w:rPr>
+          <w:rFonts w:ascii="Calibri" w:cs="Calibri" w:hAnsi="Calibri"/>
+          <w:sz w:val="22"/>
+          <w:szCs w:val="22"/>
+          <w:rtl/>
+        </w:rPr>
+        <w:t xml:space="preserve">•  ‏افتراضات الجدول الزمني: تتبع خدمات الهوية الرقمية الخليجية المماثلة المراحل نفسها (الموافقة، ثم الربط في بيئة الاختبار، ثم التقييم، ثم الإنتاج). تُصدر الموافقة المبدئية على الربط مع UAE PASS خلال 3 أيام عمل، ويحتاج الربط الكامل عادة إلى عدة أسابيع، وتستغرق مراجعة طلبات الربط مع نفاذ في السعودية نحو أسبوع إلى 3 أسابيع حسب المصادر المتاحة. ونلتزم بالجدول الذي تحدده الوزارة.‏</w:t>
+      </w:r>
+    </w:p>
+    <w:p>
+      <w:pPr>
+        <w:bidi/>
+        <w:spacing w:after="120"/>
+        <w:jc w:val="right"/>
+      </w:pPr>
+      <w:r>
+        <w:rPr>
+          <w:rFonts w:ascii="Calibri" w:cs="Calibri" w:hAnsi="Calibri"/>
+          <w:b/>
+          <w:bCs/>
+          <w:sz w:val="22"/>
+          <w:szCs w:val="22"/>
+          <w:rtl/>
+        </w:rPr>
+        <w:t xml:space="preserve">‏المصادر:‏</w:t>
+      </w:r>
+    </w:p>
+    <w:p>
+      <w:pPr>
+        <w:bidi/>
+        <w:spacing w:after="120"/>
+        <w:jc w:val="right"/>
+      </w:pPr>
+      <w:r>
+        <w:rPr>
+          <w:rFonts w:ascii="Calibri" w:cs="Calibri" w:hAnsi="Calibri"/>
+          <w:sz w:val="19"/>
+          <w:szCs w:val="19"/>
+          <w:rtl/>
+        </w:rPr>
+        <w:t xml:space="preserve">•  ‏وزارة العدل والشؤون القانونية، بيانات المحامين، عبر Open Data Oman‏</w:t>
+      </w:r>
+    </w:p>
+    <w:p>
+      <w:pPr>
+        <w:spacing w:after="120"/>
+        <w:jc w:val="right"/>
+      </w:pPr>
+      <w:r>
+        <w:rPr>
+          <w:rFonts w:ascii="Calibri" w:cs="Calibri" w:hAnsi="Calibri"/>
+          <w:sz w:val="18"/>
+          <w:szCs w:val="18"/>
+          <w:rtl w:val="false"/>
+        </w:rPr>
+        <w:t xml:space="preserve">https://opendata.om/2022/lawyers-and-law-firms-in-oman/</w:t>
+      </w:r>
+    </w:p>
+    <w:p>
+      <w:pPr>
+        <w:bidi/>
+        <w:spacing w:after="120"/>
+        <w:jc w:val="right"/>
+      </w:pPr>
+      <w:r>
+        <w:rPr>
+          <w:rFonts w:ascii="Calibri" w:cs="Calibri" w:hAnsi="Calibri"/>
+          <w:sz w:val="19"/>
+          <w:szCs w:val="19"/>
+          <w:rtl/>
+        </w:rPr>
+        <w:t xml:space="preserve">•  ‏برنامج التحول الرقمي الحكومي (تحول)، وزارة النقل والاتصالات وتقنية المعلومات‏</w:t>
+      </w:r>
+    </w:p>
+    <w:p>
+      <w:pPr>
+        <w:spacing w:after="120"/>
+        <w:jc w:val="right"/>
+      </w:pPr>
+      <w:r>
+        <w:rPr>
+          <w:rFonts w:ascii="Calibri" w:cs="Calibri" w:hAnsi="Calibri"/>
+          <w:sz w:val="18"/>
+          <w:szCs w:val="18"/>
+          <w:rtl w:val="false"/>
+        </w:rPr>
+        <w:t xml:space="preserve">https://tahawul.mtcit.gov.om/taxonomy/term/15</w:t>
+      </w:r>
+    </w:p>
+    <w:p>
+      <w:pPr>
+        <w:bidi/>
+        <w:spacing w:after="120"/>
+        <w:jc w:val="right"/>
+      </w:pPr>
+      <w:r>
+        <w:rPr>
+          <w:rFonts w:ascii="Calibri" w:cs="Calibri" w:hAnsi="Calibri"/>
+          <w:sz w:val="19"/>
+          <w:szCs w:val="19"/>
+          <w:rtl/>
+        </w:rPr>
+        <w:t xml:space="preserve">•  ‏هيئة تنظيم الاتصالات والحكومة الرقمية، طلب الربط مع UAE PASS‏</w:t>
+      </w:r>
+    </w:p>
+    <w:p>
+      <w:pPr>
+        <w:spacing w:after="120"/>
+        <w:jc w:val="right"/>
+      </w:pPr>
+      <w:r>
+        <w:rPr>
+          <w:rFonts w:ascii="Calibri" w:cs="Calibri" w:hAnsi="Calibri"/>
+          <w:sz w:val="18"/>
+          <w:szCs w:val="18"/>
+          <w:rtl w:val="false"/>
+        </w:rPr>
+        <w:t xml:space="preserve">https://tdra.gov.ae/en/Services/request-for-linking-to-uae-pass</w:t>
+      </w:r>
+    </w:p>
+    <w:p>
+      <w:pPr>
+        <w:bidi/>
+        <w:spacing w:after="120"/>
+        <w:jc w:val="right"/>
+      </w:pPr>
+      <w:r>
+        <w:rPr>
+          <w:rFonts w:ascii="Calibri" w:cs="Calibri" w:hAnsi="Calibri"/>
+          <w:sz w:val="19"/>
+          <w:szCs w:val="19"/>
+          <w:rtl/>
+        </w:rPr>
+        <w:t xml:space="preserve">•  ‏مراحل انضمام مزودي الخدمة إلى UAE PASS‏</w:t>
+      </w:r>
+    </w:p>
+    <w:p>
+      <w:pPr>
+        <w:spacing w:after="120"/>
+        <w:jc w:val="right"/>
+      </w:pPr>
+      <w:r>
+        <w:rPr>
+          <w:rFonts w:ascii="Calibri" w:cs="Calibri" w:hAnsi="Calibri"/>
+          <w:sz w:val="18"/>
+          <w:szCs w:val="18"/>
+          <w:rtl w:val="false"/>
+        </w:rPr>
+        <w:t xml:space="preserve">https://docs.uaepass.ae/getting-onboarded-with-uae-pass/onboarding-process-for-uae-pass-service-providers</w:t>
       </w:r>
     </w:p>
     <w:p>
@@ -3906,7 +4328,23 @@
           <w:szCs w:val="22"/>
           <w:rtl w:val="false"/>
         </w:rPr>
-        <w:t xml:space="preserve">The platform is at an early launch stage. These are initial estimates, which we will update after the pilot:</w:t>
+        <w:t xml:space="preserve">Market: according to the Ministry of Justice and Legal Affairs open data, Oman had 4,275 registered lawyers and 630 law offices and civil law firms (May 2022), about 7 lawyers per firm on average. Oman processed 202.9 million digital identity authentication requests by the end of 2025.</w:t>
+      </w:r>
+    </w:p>
+    <w:p>
+      <w:pPr>
+        <w:bidi w:val="false"/>
+        <w:spacing w:after="120"/>
+        <w:jc w:val="left"/>
+      </w:pPr>
+      <w:r>
+        <w:rPr>
+          <w:rFonts w:ascii="Calibri" w:cs="Calibri" w:hAnsi="Calibri"/>
+          <w:sz w:val="22"/>
+          <w:szCs w:val="22"/>
+          <w:rtl w:val="false"/>
+        </w:rPr>
+        <w:t xml:space="preserve">The platform is at an early launch stage. The estimates below are based on these figures and on the assumptions listed, and we will update them after the pilot:</w:t>
       </w:r>
     </w:p>
     <w:tbl>
@@ -4041,7 +4479,7 @@
                 <w:szCs w:val="21"/>
                 <w:rtl w:val="false"/>
               </w:rPr>
-              <w:t xml:space="preserve">5 to 10 law firms in Oman</w:t>
+              <w:t xml:space="preserve">10 firms (about 1.5% of firms in Oman)</w:t>
             </w:r>
           </w:p>
         </w:tc>
@@ -4071,7 +4509,7 @@
                 <w:szCs w:val="21"/>
                 <w:rtl w:val="false"/>
               </w:rPr>
-              <w:t xml:space="preserve">Users in the first year</w:t>
+              <w:t xml:space="preserve">Law firms by the end of year one</w:t>
             </w:r>
           </w:p>
         </w:tc>
@@ -4099,7 +4537,7 @@
                 <w:szCs w:val="21"/>
                 <w:rtl w:val="false"/>
               </w:rPr>
-              <w:t xml:space="preserve">Up to 200 (lawyers, staff and clients)</w:t>
+              <w:t xml:space="preserve">Up to 30 firms (about 5%)</w:t>
             </w:r>
           </w:p>
         </w:tc>
@@ -4129,7 +4567,7 @@
                 <w:szCs w:val="21"/>
                 <w:rtl w:val="false"/>
               </w:rPr>
-              <w:t xml:space="preserve">THEQA sign-ins per month</w:t>
+              <w:t xml:space="preserve">Users by the end of year one</w:t>
             </w:r>
           </w:p>
         </w:tc>
@@ -4157,7 +4595,7 @@
                 <w:szCs w:val="21"/>
                 <w:rtl w:val="false"/>
               </w:rPr>
-              <w:t xml:space="preserve">Up to 3,000</w:t>
+              <w:t xml:space="preserve">About 500: 210 lawyers, 60 staff and 230 clients</w:t>
             </w:r>
           </w:p>
         </w:tc>
@@ -4187,7 +4625,7 @@
                 <w:szCs w:val="21"/>
                 <w:rtl w:val="false"/>
               </w:rPr>
-              <w:t xml:space="preserve">Client identity checks per month</w:t>
+              <w:t xml:space="preserve">THEQA sign-ins per month</w:t>
             </w:r>
           </w:p>
         </w:tc>
@@ -4215,7 +4653,7 @@
                 <w:szCs w:val="21"/>
                 <w:rtl w:val="false"/>
               </w:rPr>
-              <w:t xml:space="preserve">Up to 200</w:t>
+              <w:t xml:space="preserve">About 1,800 in the pilot, up to 6,000 by the end of year one</w:t>
             </w:r>
           </w:p>
         </w:tc>
@@ -4245,7 +4683,7 @@
                 <w:szCs w:val="21"/>
                 <w:rtl w:val="false"/>
               </w:rPr>
-              <w:t xml:space="preserve">Signatures per month</w:t>
+              <w:t xml:space="preserve">Client identity checks per month</w:t>
             </w:r>
           </w:p>
         </w:tc>
@@ -4273,7 +4711,7 @@
                 <w:szCs w:val="21"/>
                 <w:rtl w:val="false"/>
               </w:rPr>
-              <w:t xml:space="preserve">Up to 300</w:t>
+              <w:t xml:space="preserve">150 to 300 by the end of year one</w:t>
             </w:r>
           </w:p>
         </w:tc>
@@ -4303,7 +4741,7 @@
                 <w:szCs w:val="21"/>
                 <w:rtl w:val="false"/>
               </w:rPr>
-              <w:t xml:space="preserve">Integration in the test environment</w:t>
+              <w:t xml:space="preserve">Signatures per month</w:t>
             </w:r>
           </w:p>
         </w:tc>
@@ -4331,7 +4769,7 @@
                 <w:szCs w:val="21"/>
                 <w:rtl w:val="false"/>
               </w:rPr>
-              <w:t xml:space="preserve">Within 4 weeks of receiving the technical documents</w:t>
+              <w:t xml:space="preserve">About 300 by the end of year one</w:t>
             </w:r>
           </w:p>
         </w:tc>
@@ -4361,7 +4799,7 @@
                 <w:szCs w:val="21"/>
                 <w:rtl w:val="false"/>
               </w:rPr>
-              <w:t xml:space="preserve">Pilot launch with selected firms</w:t>
+              <w:t xml:space="preserve">Request review and initial approval</w:t>
             </w:r>
           </w:p>
         </w:tc>
@@ -4389,7 +4827,239 @@
                 <w:szCs w:val="21"/>
                 <w:rtl w:val="false"/>
               </w:rPr>
-              <w:t xml:space="preserve">Within 2 months of approval in the test environment</w:t>
+              <w:t xml:space="preserve">1 to 3 weeks</w:t>
+            </w:r>
+          </w:p>
+        </w:tc>
+      </w:tr>
+      <w:tr>
+        <w:tc>
+          <w:tcPr>
+            <w:tcW w:type="pct" w:w="1900"/>
+            <w:tcBorders>
+              <w:top w:val="single" w:color="BFBFBF" w:sz="4"/>
+              <w:left w:val="single" w:color="BFBFBF" w:sz="4"/>
+              <w:bottom w:val="single" w:color="BFBFBF" w:sz="4"/>
+              <w:right w:val="single" w:color="BFBFBF" w:sz="4"/>
+            </w:tcBorders>
+          </w:tcPr>
+          <w:p>
+            <w:pPr>
+              <w:bidi w:val="false"/>
+              <w:spacing w:after="120"/>
+              <w:jc w:val="left"/>
+            </w:pPr>
+            <w:r>
+              <w:rPr>
+                <w:rFonts w:ascii="Calibri" w:cs="Calibri" w:hAnsi="Calibri"/>
+                <w:b w:val="false"/>
+                <w:sz w:val="21"/>
+                <w:szCs w:val="21"/>
+                <w:rtl w:val="false"/>
+              </w:rPr>
+              <w:t xml:space="preserve">Integration and testing in the test environment</w:t>
+            </w:r>
+          </w:p>
+        </w:tc>
+        <w:tc>
+          <w:tcPr>
+            <w:tcW w:type="pct" w:w="3100"/>
+            <w:tcBorders>
+              <w:top w:val="single" w:color="BFBFBF" w:sz="4"/>
+              <w:left w:val="single" w:color="BFBFBF" w:sz="4"/>
+              <w:bottom w:val="single" w:color="BFBFBF" w:sz="4"/>
+              <w:right w:val="single" w:color="BFBFBF" w:sz="4"/>
+            </w:tcBorders>
+          </w:tcPr>
+          <w:p>
+            <w:pPr>
+              <w:bidi w:val="false"/>
+              <w:spacing w:after="120"/>
+              <w:jc w:val="left"/>
+            </w:pPr>
+            <w:r>
+              <w:rPr>
+                <w:rFonts w:ascii="Calibri" w:cs="Calibri" w:hAnsi="Calibri"/>
+                <w:b w:val="false"/>
+                <w:sz w:val="21"/>
+                <w:szCs w:val="21"/>
+                <w:rtl w:val="false"/>
+              </w:rPr>
+              <w:t xml:space="preserve">4 to 6 weeks from receiving the technical documents</w:t>
+            </w:r>
+          </w:p>
+        </w:tc>
+      </w:tr>
+      <w:tr>
+        <w:tc>
+          <w:tcPr>
+            <w:tcW w:type="pct" w:w="1900"/>
+            <w:tcBorders>
+              <w:top w:val="single" w:color="BFBFBF" w:sz="4"/>
+              <w:left w:val="single" w:color="BFBFBF" w:sz="4"/>
+              <w:bottom w:val="single" w:color="BFBFBF" w:sz="4"/>
+              <w:right w:val="single" w:color="BFBFBF" w:sz="4"/>
+            </w:tcBorders>
+          </w:tcPr>
+          <w:p>
+            <w:pPr>
+              <w:bidi w:val="false"/>
+              <w:spacing w:after="120"/>
+              <w:jc w:val="left"/>
+            </w:pPr>
+            <w:r>
+              <w:rPr>
+                <w:rFonts w:ascii="Calibri" w:cs="Calibri" w:hAnsi="Calibri"/>
+                <w:b w:val="false"/>
+                <w:sz w:val="21"/>
+                <w:szCs w:val="21"/>
+                <w:rtl w:val="false"/>
+              </w:rPr>
+              <w:t xml:space="preserve">Security assessment and production credentials</w:t>
+            </w:r>
+          </w:p>
+        </w:tc>
+        <w:tc>
+          <w:tcPr>
+            <w:tcW w:type="pct" w:w="3100"/>
+            <w:tcBorders>
+              <w:top w:val="single" w:color="BFBFBF" w:sz="4"/>
+              <w:left w:val="single" w:color="BFBFBF" w:sz="4"/>
+              <w:bottom w:val="single" w:color="BFBFBF" w:sz="4"/>
+              <w:right w:val="single" w:color="BFBFBF" w:sz="4"/>
+            </w:tcBorders>
+          </w:tcPr>
+          <w:p>
+            <w:pPr>
+              <w:bidi w:val="false"/>
+              <w:spacing w:after="120"/>
+              <w:jc w:val="left"/>
+            </w:pPr>
+            <w:r>
+              <w:rPr>
+                <w:rFonts w:ascii="Calibri" w:cs="Calibri" w:hAnsi="Calibri"/>
+                <w:b w:val="false"/>
+                <w:sz w:val="21"/>
+                <w:szCs w:val="21"/>
+                <w:rtl w:val="false"/>
+              </w:rPr>
+              <w:t xml:space="preserve">2 to 4 weeks</w:t>
+            </w:r>
+          </w:p>
+        </w:tc>
+      </w:tr>
+      <w:tr>
+        <w:tc>
+          <w:tcPr>
+            <w:tcW w:type="pct" w:w="1900"/>
+            <w:tcBorders>
+              <w:top w:val="single" w:color="BFBFBF" w:sz="4"/>
+              <w:left w:val="single" w:color="BFBFBF" w:sz="4"/>
+              <w:bottom w:val="single" w:color="BFBFBF" w:sz="4"/>
+              <w:right w:val="single" w:color="BFBFBF" w:sz="4"/>
+            </w:tcBorders>
+          </w:tcPr>
+          <w:p>
+            <w:pPr>
+              <w:bidi w:val="false"/>
+              <w:spacing w:after="120"/>
+              <w:jc w:val="left"/>
+            </w:pPr>
+            <w:r>
+              <w:rPr>
+                <w:rFonts w:ascii="Calibri" w:cs="Calibri" w:hAnsi="Calibri"/>
+                <w:b w:val="false"/>
+                <w:sz w:val="21"/>
+                <w:szCs w:val="21"/>
+                <w:rtl w:val="false"/>
+              </w:rPr>
+              <w:t xml:space="preserve">Pilot launch</w:t>
+            </w:r>
+          </w:p>
+        </w:tc>
+        <w:tc>
+          <w:tcPr>
+            <w:tcW w:type="pct" w:w="3100"/>
+            <w:tcBorders>
+              <w:top w:val="single" w:color="BFBFBF" w:sz="4"/>
+              <w:left w:val="single" w:color="BFBFBF" w:sz="4"/>
+              <w:bottom w:val="single" w:color="BFBFBF" w:sz="4"/>
+              <w:right w:val="single" w:color="BFBFBF" w:sz="4"/>
+            </w:tcBorders>
+          </w:tcPr>
+          <w:p>
+            <w:pPr>
+              <w:bidi w:val="false"/>
+              <w:spacing w:after="120"/>
+              <w:jc w:val="left"/>
+            </w:pPr>
+            <w:r>
+              <w:rPr>
+                <w:rFonts w:ascii="Calibri" w:cs="Calibri" w:hAnsi="Calibri"/>
+                <w:b w:val="false"/>
+                <w:sz w:val="21"/>
+                <w:szCs w:val="21"/>
+                <w:rtl w:val="false"/>
+              </w:rPr>
+              <w:t xml:space="preserve">About 3 months from receiving the technical documents</w:t>
+            </w:r>
+          </w:p>
+        </w:tc>
+      </w:tr>
+      <w:tr>
+        <w:tc>
+          <w:tcPr>
+            <w:tcW w:type="pct" w:w="1900"/>
+            <w:tcBorders>
+              <w:top w:val="single" w:color="BFBFBF" w:sz="4"/>
+              <w:left w:val="single" w:color="BFBFBF" w:sz="4"/>
+              <w:bottom w:val="single" w:color="BFBFBF" w:sz="4"/>
+              <w:right w:val="single" w:color="BFBFBF" w:sz="4"/>
+            </w:tcBorders>
+          </w:tcPr>
+          <w:p>
+            <w:pPr>
+              <w:bidi w:val="false"/>
+              <w:spacing w:after="120"/>
+              <w:jc w:val="left"/>
+            </w:pPr>
+            <w:r>
+              <w:rPr>
+                <w:rFonts w:ascii="Calibri" w:cs="Calibri" w:hAnsi="Calibri"/>
+                <w:b w:val="false"/>
+                <w:sz w:val="21"/>
+                <w:szCs w:val="21"/>
+                <w:rtl w:val="false"/>
+              </w:rPr>
+              <w:t xml:space="preserve">Launch to all subscribing firms</w:t>
+            </w:r>
+          </w:p>
+        </w:tc>
+        <w:tc>
+          <w:tcPr>
+            <w:tcW w:type="pct" w:w="3100"/>
+            <w:tcBorders>
+              <w:top w:val="single" w:color="BFBFBF" w:sz="4"/>
+              <w:left w:val="single" w:color="BFBFBF" w:sz="4"/>
+              <w:bottom w:val="single" w:color="BFBFBF" w:sz="4"/>
+              <w:right w:val="single" w:color="BFBFBF" w:sz="4"/>
+            </w:tcBorders>
+          </w:tcPr>
+          <w:p>
+            <w:pPr>
+              <w:bidi w:val="false"/>
+              <w:spacing w:after="120"/>
+              <w:jc w:val="left"/>
+            </w:pPr>
+            <w:r>
+              <w:rPr>
+                <w:rFonts w:ascii="Calibri" w:cs="Calibri" w:hAnsi="Calibri"/>
+                <w:b w:val="false"/>
+                <w:sz w:val="21"/>
+                <w:szCs w:val="21"/>
+                <w:rtl w:val="false"/>
+              </w:rPr>
+              <w:t xml:space="preserve">4 to 6 months from receiving the technical documents</w:t>
             </w:r>
           </w:p>
         </w:tc>
@@ -4409,6 +5079,180 @@
           <w:rtl w:val="false"/>
         </w:rPr>
         <w:t xml:space="preserve"/>
+      </w:r>
+    </w:p>
+    <w:p>
+      <w:pPr>
+        <w:bidi w:val="false"/>
+        <w:spacing w:after="120"/>
+        <w:jc w:val="left"/>
+      </w:pPr>
+      <w:r>
+        <w:rPr>
+          <w:rFonts w:ascii="Calibri" w:cs="Calibri" w:hAnsi="Calibri"/>
+          <w:sz w:val="22"/>
+          <w:szCs w:val="22"/>
+          <w:rtl w:val="false"/>
+        </w:rPr>
+        <w:t xml:space="preserve">•  Usage assumptions: a lawyer or staff member signs in about 20 times a month (once per working day), a client about twice a month; each firm opens 5 to 10 new client files and signs about 10 documents a month.</w:t>
+      </w:r>
+    </w:p>
+    <w:p>
+      <w:pPr>
+        <w:bidi w:val="false"/>
+        <w:spacing w:after="120"/>
+        <w:jc w:val="left"/>
+      </w:pPr>
+      <w:r>
+        <w:rPr>
+          <w:rFonts w:ascii="Calibri" w:cs="Calibri" w:hAnsi="Calibri"/>
+          <w:sz w:val="22"/>
+          <w:szCs w:val="22"/>
+          <w:rtl w:val="false"/>
+        </w:rPr>
+        <w:t xml:space="preserve">•  Timeline assumptions: comparable GCC digital identity services follow the same stages (approval, test environment integration, assessment, production). UAE PASS gives initial linking approval within 3 working days and a full integration usually takes several weeks; published sources put the review of Saudi Nafath integration requests at about 1 to 3 weeks. We will follow the timeline the Ministry sets.</w:t>
+      </w:r>
+    </w:p>
+    <w:p>
+      <w:pPr>
+        <w:bidi w:val="false"/>
+        <w:spacing w:after="120"/>
+        <w:jc w:val="left"/>
+      </w:pPr>
+      <w:r>
+        <w:rPr>
+          <w:rFonts w:ascii="Calibri" w:cs="Calibri" w:hAnsi="Calibri"/>
+          <w:b/>
+          <w:bCs/>
+          <w:sz w:val="22"/>
+          <w:szCs w:val="22"/>
+          <w:rtl w:val="false"/>
+        </w:rPr>
+        <w:t xml:space="preserve">Sources:</w:t>
+      </w:r>
+    </w:p>
+    <w:p>
+      <w:pPr>
+        <w:bidi w:val="false"/>
+        <w:spacing w:after="120"/>
+        <w:jc w:val="left"/>
+      </w:pPr>
+      <w:r>
+        <w:rPr>
+          <w:rFonts w:ascii="Calibri" w:cs="Calibri" w:hAnsi="Calibri"/>
+          <w:sz w:val="19"/>
+          <w:szCs w:val="19"/>
+          <w:rtl w:val="false"/>
+        </w:rPr>
+        <w:t xml:space="preserve">•  Ministry of Justice and Legal Affairs, lawyers data, via Open Data Oman</w:t>
+      </w:r>
+    </w:p>
+    <w:p>
+      <w:pPr>
+        <w:spacing w:after="120"/>
+        <w:jc w:val="left"/>
+      </w:pPr>
+      <w:r>
+        <w:rPr>
+          <w:rFonts w:ascii="Calibri" w:cs="Calibri" w:hAnsi="Calibri"/>
+          <w:sz w:val="18"/>
+          <w:szCs w:val="18"/>
+          <w:rtl w:val="false"/>
+        </w:rPr>
+        <w:t xml:space="preserve">https://opendata.om/2022/lawyers-and-law-firms-in-oman/</w:t>
+      </w:r>
+    </w:p>
+    <w:p>
+      <w:pPr>
+        <w:bidi w:val="false"/>
+        <w:spacing w:after="120"/>
+        <w:jc w:val="left"/>
+      </w:pPr>
+      <w:r>
+        <w:rPr>
+          <w:rFonts w:ascii="Calibri" w:cs="Calibri" w:hAnsi="Calibri"/>
+          <w:sz w:val="19"/>
+          <w:szCs w:val="19"/>
+          <w:rtl w:val="false"/>
+        </w:rPr>
+        <w:t xml:space="preserve">•  Government Digital Transformation Programme (Tahawul), MTCIT</w:t>
+      </w:r>
+    </w:p>
+    <w:p>
+      <w:pPr>
+        <w:spacing w:after="120"/>
+        <w:jc w:val="left"/>
+      </w:pPr>
+      <w:r>
+        <w:rPr>
+          <w:rFonts w:ascii="Calibri" w:cs="Calibri" w:hAnsi="Calibri"/>
+          <w:sz w:val="18"/>
+          <w:szCs w:val="18"/>
+          <w:rtl w:val="false"/>
+        </w:rPr>
+        <w:t xml:space="preserve">https://tahawul.mtcit.gov.om/taxonomy/term/15</w:t>
+      </w:r>
+    </w:p>
+    <w:p>
+      <w:pPr>
+        <w:bidi w:val="false"/>
+        <w:spacing w:after="120"/>
+        <w:jc w:val="left"/>
+      </w:pPr>
+      <w:r>
+        <w:rPr>
+          <w:rFonts w:ascii="Calibri" w:cs="Calibri" w:hAnsi="Calibri"/>
+          <w:sz w:val="19"/>
+          <w:szCs w:val="19"/>
+          <w:rtl w:val="false"/>
+        </w:rPr>
+        <w:t xml:space="preserve">•  TDRA, request for linking to UAE PASS</w:t>
+      </w:r>
+    </w:p>
+    <w:p>
+      <w:pPr>
+        <w:spacing w:after="120"/>
+        <w:jc w:val="left"/>
+      </w:pPr>
+      <w:r>
+        <w:rPr>
+          <w:rFonts w:ascii="Calibri" w:cs="Calibri" w:hAnsi="Calibri"/>
+          <w:sz w:val="18"/>
+          <w:szCs w:val="18"/>
+          <w:rtl w:val="false"/>
+        </w:rPr>
+        <w:t xml:space="preserve">https://tdra.gov.ae/en/Services/request-for-linking-to-uae-pass</w:t>
+      </w:r>
+    </w:p>
+    <w:p>
+      <w:pPr>
+        <w:bidi w:val="false"/>
+        <w:spacing w:after="120"/>
+        <w:jc w:val="left"/>
+      </w:pPr>
+      <w:r>
+        <w:rPr>
+          <w:rFonts w:ascii="Calibri" w:cs="Calibri" w:hAnsi="Calibri"/>
+          <w:sz w:val="19"/>
+          <w:szCs w:val="19"/>
+          <w:rtl w:val="false"/>
+        </w:rPr>
+        <w:t xml:space="preserve">•  UAE PASS service provider onboarding phases</w:t>
+      </w:r>
+    </w:p>
+    <w:p>
+      <w:pPr>
+        <w:spacing w:after="120"/>
+        <w:jc w:val="left"/>
+      </w:pPr>
+      <w:r>
+        <w:rPr>
+          <w:rFonts w:ascii="Calibri" w:cs="Calibri" w:hAnsi="Calibri"/>
+          <w:sz w:val="18"/>
+          <w:szCs w:val="18"/>
+          <w:rtl w:val="false"/>
+        </w:rPr>
+        <w:t xml:space="preserve">https://docs.uaepass.ae/getting-onboarded-with-uae-pass/onboarding-process-for-uae-pass-service-providers</w:t>
       </w:r>
     </w:p>
     <w:p>

</xml_diff>